<commit_message>
Cambiados errores y actualizado documento de Caso de Prueba de Receipt
</commit_message>
<xml_diff>
--- a/test/AppForSEII2526.UIT/Receipt/Casos de Prueba Patrik.docx
+++ b/test/AppForSEII2526.UIT/Receipt/Casos de Prueba Patrik.docx
@@ -1676,19 +1676,19 @@
         <w:tblLook w:val="04A0" w:firstRow="1" w:lastRow="0" w:firstColumn="1" w:lastColumn="0" w:noHBand="0" w:noVBand="1"/>
       </w:tblPr>
       <w:tblGrid>
-        <w:gridCol w:w="642"/>
-        <w:gridCol w:w="1771"/>
-        <w:gridCol w:w="3181"/>
-        <w:gridCol w:w="1550"/>
-        <w:gridCol w:w="1233"/>
-        <w:gridCol w:w="1621"/>
-        <w:gridCol w:w="1107"/>
-        <w:gridCol w:w="2071"/>
+        <w:gridCol w:w="762"/>
+        <w:gridCol w:w="2208"/>
+        <w:gridCol w:w="2256"/>
+        <w:gridCol w:w="1490"/>
+        <w:gridCol w:w="1519"/>
+        <w:gridCol w:w="1626"/>
+        <w:gridCol w:w="1126"/>
+        <w:gridCol w:w="1963"/>
       </w:tblGrid>
       <w:tr>
         <w:tc>
           <w:tcPr>
-            <w:tcW w:w="1019" w:type="dxa"/>
+            <w:tcW w:w="662" w:type="dxa"/>
           </w:tcPr>
           <w:p>
             <w:pPr>
@@ -1706,7 +1706,7 @@
         </w:tc>
         <w:tc>
           <w:tcPr>
-            <w:tcW w:w="2208" w:type="dxa"/>
+            <w:tcW w:w="1845" w:type="dxa"/>
           </w:tcPr>
           <w:p>
             <w:pPr>
@@ -1724,7 +1724,7 @@
         </w:tc>
         <w:tc>
           <w:tcPr>
-            <w:tcW w:w="1518" w:type="dxa"/>
+            <w:tcW w:w="3322" w:type="dxa"/>
           </w:tcPr>
           <w:p>
             <w:pPr>
@@ -1742,7 +1742,7 @@
         </w:tc>
         <w:tc>
           <w:tcPr>
-            <w:tcW w:w="1607" w:type="dxa"/>
+            <w:tcW w:w="1258" w:type="dxa"/>
           </w:tcPr>
           <w:p>
             <w:pPr>
@@ -1760,7 +1760,7 @@
         </w:tc>
         <w:tc>
           <w:tcPr>
-            <w:tcW w:w="1607" w:type="dxa"/>
+            <w:tcW w:w="1282" w:type="dxa"/>
           </w:tcPr>
           <w:p>
             <w:pPr>
@@ -1781,7 +1781,7 @@
         </w:tc>
         <w:tc>
           <w:tcPr>
-            <w:tcW w:w="1491" w:type="dxa"/>
+            <w:tcW w:w="1688" w:type="dxa"/>
           </w:tcPr>
           <w:p>
             <w:pPr>
@@ -1799,7 +1799,7 @@
         </w:tc>
         <w:tc>
           <w:tcPr>
-            <w:tcW w:w="1460" w:type="dxa"/>
+            <w:tcW w:w="1108" w:type="dxa"/>
           </w:tcPr>
           <w:p>
             <w:pPr>
@@ -1817,7 +1817,7 @@
         </w:tc>
         <w:tc>
           <w:tcPr>
-            <w:tcW w:w="2266" w:type="dxa"/>
+            <w:tcW w:w="2011" w:type="dxa"/>
           </w:tcPr>
           <w:p>
             <w:pPr>
@@ -1837,7 +1837,7 @@
       <w:tr>
         <w:tc>
           <w:tcPr>
-            <w:tcW w:w="1019" w:type="dxa"/>
+            <w:tcW w:w="662" w:type="dxa"/>
           </w:tcPr>
           <w:p>
             <w:pPr>
@@ -1859,7 +1859,7 @@
         </w:tc>
         <w:tc>
           <w:tcPr>
-            <w:tcW w:w="2208" w:type="dxa"/>
+            <w:tcW w:w="1845" w:type="dxa"/>
           </w:tcPr>
           <w:p>
             <w:pPr>
@@ -1897,7 +1897,7 @@
         </w:tc>
         <w:tc>
           <w:tcPr>
-            <w:tcW w:w="1518" w:type="dxa"/>
+            <w:tcW w:w="3322" w:type="dxa"/>
           </w:tcPr>
           <w:p>
             <w:pPr>
@@ -1915,7 +1915,7 @@
         </w:tc>
         <w:tc>
           <w:tcPr>
-            <w:tcW w:w="1607" w:type="dxa"/>
+            <w:tcW w:w="1258" w:type="dxa"/>
           </w:tcPr>
           <w:p>
             <w:pPr>
@@ -1940,7 +1940,7 @@
         </w:tc>
         <w:tc>
           <w:tcPr>
-            <w:tcW w:w="1607" w:type="dxa"/>
+            <w:tcW w:w="1282" w:type="dxa"/>
           </w:tcPr>
           <w:p>
             <w:pPr>
@@ -1960,89 +1960,272 @@
         </w:tc>
         <w:tc>
           <w:tcPr>
-            <w:tcW w:w="1491" w:type="dxa"/>
-          </w:tcPr>
-          <w:p>
-            <w:pPr>
-              <w:rPr>
-                <w:lang w:val="es-ES"/>
-              </w:rPr>
-            </w:pPr>
+            <w:tcW w:w="1688" w:type="dxa"/>
+          </w:tcPr>
+          <w:p>
+            <w:pPr>
+              <w:rPr>
+                <w:u w:val="single"/>
+                <w:lang w:val="es-ES"/>
+              </w:rPr>
+            </w:pPr>
+            <w:r>
+              <w:rPr>
+                <w:lang w:val="es-ES"/>
+              </w:rPr>
+              <w:t>Modelos: “</w:t>
+            </w:r>
             <w:proofErr w:type="spellStart"/>
             <w:r>
-              <w:t>Modelos</w:t>
+              <w:rPr>
+                <w:lang w:val="es-ES"/>
+              </w:rPr>
+              <w:t>Iphone</w:t>
             </w:r>
             <w:proofErr w:type="spellEnd"/>
             <w:r>
-              <w:t>: “</w:t>
+              <w:rPr>
+                <w:lang w:val="es-ES"/>
+              </w:rPr>
+              <w:t xml:space="preserve">” para </w:t>
+            </w:r>
+            <w:r>
+              <w:rPr>
+                <w:lang w:val="es-ES"/>
+              </w:rPr>
+              <w:t>reparación de sensor</w:t>
+            </w:r>
+            <w:r>
+              <w:rPr>
+                <w:lang w:val="es-ES"/>
+              </w:rPr>
+              <w:t xml:space="preserve">, “Android” para </w:t>
+            </w:r>
+            <w:r>
+              <w:rPr>
+                <w:lang w:val="es-ES"/>
+              </w:rPr>
+              <w:t>Calibración de precisión</w:t>
+            </w:r>
+          </w:p>
+        </w:tc>
+        <w:tc>
+          <w:tcPr>
+            <w:tcW w:w="1108" w:type="dxa"/>
+          </w:tcPr>
+          <w:p>
+            <w:pPr>
+              <w:rPr>
+                <w:lang w:val="es-ES"/>
+              </w:rPr>
+            </w:pPr>
+            <w:r>
+              <w:rPr>
+                <w:lang w:val="es-ES"/>
+              </w:rPr>
+              <w:t>Método pago: “Tarjeta de Crédito” </w:t>
+            </w:r>
+          </w:p>
+        </w:tc>
+        <w:tc>
+          <w:tcPr>
+            <w:tcW w:w="2011" w:type="dxa"/>
+          </w:tcPr>
+          <w:p>
+            <w:pPr>
+              <w:rPr>
+                <w:lang w:val="es-ES"/>
+              </w:rPr>
+            </w:pPr>
+            <w:r>
+              <w:rPr>
+                <w:lang w:val="es-ES"/>
+              </w:rPr>
+              <w:t>“</w:t>
             </w:r>
             <w:proofErr w:type="spellStart"/>
             <w:r>
+              <w:rPr>
+                <w:lang w:val="es-ES"/>
+              </w:rPr>
+              <w:t>Details</w:t>
+            </w:r>
+            <w:proofErr w:type="spellEnd"/>
+            <w:r>
+              <w:rPr>
+                <w:lang w:val="es-ES"/>
+              </w:rPr>
+              <w:t>” – AppForSEII2526, “</w:t>
+            </w:r>
+            <w:proofErr w:type="spellStart"/>
+            <w:r>
+              <w:rPr>
+                <w:lang w:val="es-ES"/>
+              </w:rPr>
+              <w:t>Details</w:t>
+            </w:r>
+            <w:proofErr w:type="spellEnd"/>
+            <w:r>
+              <w:rPr>
+                <w:lang w:val="es-ES"/>
+              </w:rPr>
+              <w:t>”</w:t>
+            </w:r>
+          </w:p>
+          <w:p>
+            <w:pPr>
+              <w:rPr>
+                <w:lang w:val="es-ES"/>
+              </w:rPr>
+            </w:pPr>
+            <w:r>
+              <w:rPr>
+                <w:lang w:val="es-ES"/>
+              </w:rPr>
+              <w:t>Luis</w:t>
+            </w:r>
+            <w:r>
+              <w:rPr>
+                <w:lang w:val="es-ES"/>
+              </w:rPr>
+              <w:t xml:space="preserve"> </w:t>
+            </w:r>
+            <w:r>
+              <w:rPr>
+                <w:lang w:val="es-ES"/>
+              </w:rPr>
+              <w:t>Lorenzo, Calle</w:t>
+            </w:r>
+            <w:r>
+              <w:rPr>
+                <w:lang w:val="es-ES"/>
+              </w:rPr>
+              <w:t xml:space="preserve"> Mayor 5</w:t>
+            </w:r>
+            <w:r>
+              <w:rPr>
+                <w:lang w:val="es-ES"/>
+              </w:rPr>
+              <w:t xml:space="preserve">, </w:t>
+            </w:r>
+            <w:proofErr w:type="spellStart"/>
+            <w:r>
+              <w:rPr>
+                <w:lang w:val="es-ES"/>
+              </w:rPr>
+              <w:t>CreditCard</w:t>
+            </w:r>
+            <w:proofErr w:type="spellEnd"/>
+            <w:r>
+              <w:rPr>
+                <w:lang w:val="es-ES"/>
+              </w:rPr>
+              <w:t xml:space="preserve">, </w:t>
+            </w:r>
+            <w:r>
+              <w:rPr>
+                <w:lang w:val="es-ES"/>
+              </w:rPr>
+              <w:t>17/12/2025</w:t>
+            </w:r>
+            <w:r>
+              <w:rPr>
+                <w:lang w:val="es-ES"/>
+              </w:rPr>
+              <w:t xml:space="preserve">, </w:t>
+            </w:r>
+            <w:r>
+              <w:rPr>
+                <w:lang w:val="es-ES"/>
+              </w:rPr>
+              <w:t xml:space="preserve">reparación de sensor, Baja, </w:t>
+            </w:r>
+            <w:proofErr w:type="spellStart"/>
+            <w:r>
+              <w:rPr>
+                <w:lang w:val="es-ES"/>
+              </w:rPr>
               <w:t>Iphone</w:t>
             </w:r>
             <w:proofErr w:type="spellEnd"/>
             <w:r>
-              <w:t xml:space="preserve">” </w:t>
-            </w:r>
-            <w:proofErr w:type="gramStart"/>
-            <w:r>
-              <w:t>para REPAIR</w:t>
-            </w:r>
-            <w:proofErr w:type="gramEnd"/>
-            <w:r>
-              <w:t xml:space="preserve">_NAME_1, “Android” </w:t>
-            </w:r>
-            <w:proofErr w:type="gramStart"/>
-            <w:r>
-              <w:t>para REPAIR</w:t>
-            </w:r>
-            <w:proofErr w:type="gramEnd"/>
-            <w:r>
-              <w:t>_NAME_2 </w:t>
-            </w:r>
-          </w:p>
-        </w:tc>
-        <w:tc>
-          <w:tcPr>
-            <w:tcW w:w="1460" w:type="dxa"/>
-          </w:tcPr>
-          <w:p>
-            <w:pPr>
-              <w:rPr>
-                <w:lang w:val="es-ES"/>
-              </w:rPr>
-            </w:pPr>
-            <w:r>
-              <w:rPr>
-                <w:lang w:val="es-ES"/>
-              </w:rPr>
-              <w:t>Método pago: “Tarjeta de Crédito” </w:t>
-            </w:r>
-          </w:p>
-        </w:tc>
-        <w:tc>
-          <w:tcPr>
-            <w:tcW w:w="2266" w:type="dxa"/>
-          </w:tcPr>
-          <w:p>
-            <w:pPr>
-              <w:rPr>
-                <w:lang w:val="es-ES"/>
-              </w:rPr>
-            </w:pPr>
-            <w:r>
-              <w:rPr>
-                <w:lang w:val="es-ES"/>
-              </w:rPr>
-              <w:t xml:space="preserve">Se crea el recibo, con los respectivos datos </w:t>
-            </w:r>
+              <w:rPr>
+                <w:lang w:val="es-ES"/>
+              </w:rPr>
+              <w:t>, 85.5</w:t>
+            </w:r>
+            <w:r>
+              <w:rPr>
+                <w:lang w:val="es-ES"/>
+              </w:rPr>
+              <w:t>€</w:t>
+            </w:r>
+          </w:p>
+          <w:p>
+            <w:pPr>
+              <w:rPr>
+                <w:lang w:val="es-ES"/>
+              </w:rPr>
+            </w:pPr>
+            <w:proofErr w:type="spellStart"/>
+            <w:r>
+              <w:rPr>
+                <w:lang w:val="es-ES"/>
+              </w:rPr>
+              <w:t>Calibracion</w:t>
+            </w:r>
+            <w:proofErr w:type="spellEnd"/>
+            <w:r>
+              <w:rPr>
+                <w:lang w:val="es-ES"/>
+              </w:rPr>
+              <w:t xml:space="preserve"> de precisión, Mediocre, Android, 45</w:t>
+            </w:r>
+            <w:r>
+              <w:rPr>
+                <w:lang w:val="es-ES"/>
+              </w:rPr>
+              <w:t>€</w:t>
+            </w:r>
+            <w:r>
+              <w:rPr>
+                <w:lang w:val="es-ES"/>
+              </w:rPr>
+              <w:t xml:space="preserve">, Total Price </w:t>
+            </w:r>
+            <w:r>
+              <w:rPr>
+                <w:u w:val="single"/>
+                <w:lang w:val="es-ES"/>
+              </w:rPr>
+              <w:t>130</w:t>
+            </w:r>
+            <w:r>
+              <w:rPr>
+                <w:lang w:val="es-ES"/>
+              </w:rPr>
+              <w:t>.5</w:t>
+            </w:r>
+            <w:r>
+              <w:rPr>
+                <w:lang w:val="es-ES"/>
+              </w:rPr>
+              <w:t>€</w:t>
+            </w:r>
+          </w:p>
+          <w:p>
+            <w:pPr>
+              <w:rPr>
+                <w:lang w:val="es-ES"/>
+              </w:rPr>
+            </w:pPr>
           </w:p>
         </w:tc>
       </w:tr>
       <w:tr>
         <w:tc>
           <w:tcPr>
-            <w:tcW w:w="1019" w:type="dxa"/>
+            <w:tcW w:w="662" w:type="dxa"/>
           </w:tcPr>
           <w:p>
             <w:pPr>
@@ -2058,13 +2241,22 @@
                 <w:bCs/>
                 <w:lang w:val="es-ES"/>
               </w:rPr>
-              <w:t>UC4-01b</w:t>
-            </w:r>
-          </w:p>
-        </w:tc>
-        <w:tc>
-          <w:tcPr>
-            <w:tcW w:w="2208" w:type="dxa"/>
+              <w:t>UC4-</w:t>
+            </w:r>
+            <w:r>
+              <w:rPr>
+                <w:b/>
+                <w:bCs/>
+                <w:lang w:val="es-ES"/>
+              </w:rPr>
+              <w:lastRenderedPageBreak/>
+              <w:t>01b</w:t>
+            </w:r>
+          </w:p>
+        </w:tc>
+        <w:tc>
+          <w:tcPr>
+            <w:tcW w:w="1845" w:type="dxa"/>
           </w:tcPr>
           <w:p>
             <w:pPr>
@@ -2077,7 +2269,15 @@
               <w:rPr>
                 <w:lang w:val="es-ES"/>
               </w:rPr>
-              <w:t>Esc-1/</w:t>
+              <w:lastRenderedPageBreak/>
+              <w:t>Esc-</w:t>
+            </w:r>
+            <w:r>
+              <w:rPr>
+                <w:lang w:val="es-ES"/>
+              </w:rPr>
+              <w:lastRenderedPageBreak/>
+              <w:t>1/</w:t>
             </w:r>
             <w:proofErr w:type="spellStart"/>
             <w:r>
@@ -2091,19 +2291,27 @@
         </w:tc>
         <w:tc>
           <w:tcPr>
-            <w:tcW w:w="1518" w:type="dxa"/>
-          </w:tcPr>
-          <w:p>
-            <w:pPr>
-              <w:rPr>
-                <w:lang w:val="es-ES"/>
-              </w:rPr>
-            </w:pPr>
-            <w:r>
-              <w:rPr>
-                <w:lang w:val="es-ES"/>
-              </w:rPr>
-              <w:t>Reparación seleccionada: “Reparación de sensor” </w:t>
+            <w:tcW w:w="3322" w:type="dxa"/>
+          </w:tcPr>
+          <w:p>
+            <w:pPr>
+              <w:rPr>
+                <w:lang w:val="es-ES"/>
+              </w:rPr>
+            </w:pPr>
+            <w:r>
+              <w:rPr>
+                <w:lang w:val="es-ES"/>
+              </w:rPr>
+              <w:lastRenderedPageBreak/>
+              <w:t xml:space="preserve">Reparación </w:t>
+            </w:r>
+            <w:r>
+              <w:rPr>
+                <w:lang w:val="es-ES"/>
+              </w:rPr>
+              <w:lastRenderedPageBreak/>
+              <w:t>seleccionada: “Reparación de sensor” </w:t>
             </w:r>
             <w:r>
               <w:rPr>
@@ -2116,25 +2324,45 @@
         </w:tc>
         <w:tc>
           <w:tcPr>
-            <w:tcW w:w="1607" w:type="dxa"/>
-          </w:tcPr>
-          <w:p>
-            <w:pPr>
-              <w:rPr>
-                <w:lang w:val="es-ES"/>
-              </w:rPr>
-            </w:pPr>
-            <w:r>
-              <w:rPr>
-                <w:lang w:val="es-ES"/>
-              </w:rPr>
-              <w:t>Datos cliente completos (nombre, apellidos) </w:t>
-            </w:r>
-          </w:p>
-        </w:tc>
-        <w:tc>
-          <w:tcPr>
-            <w:tcW w:w="1607" w:type="dxa"/>
+            <w:tcW w:w="1258" w:type="dxa"/>
+          </w:tcPr>
+          <w:p>
+            <w:pPr>
+              <w:rPr>
+                <w:lang w:val="es-ES"/>
+              </w:rPr>
+            </w:pPr>
+            <w:r>
+              <w:rPr>
+                <w:lang w:val="es-ES"/>
+              </w:rPr>
+              <w:lastRenderedPageBreak/>
+              <w:t xml:space="preserve">Datos </w:t>
+            </w:r>
+            <w:r>
+              <w:rPr>
+                <w:lang w:val="es-ES"/>
+              </w:rPr>
+              <w:lastRenderedPageBreak/>
+              <w:t>cliente completos (</w:t>
+            </w:r>
+            <w:r>
+              <w:rPr>
+                <w:lang w:val="es-ES"/>
+              </w:rPr>
+              <w:t>nombre</w:t>
+            </w:r>
+            <w:r>
+              <w:rPr>
+                <w:lang w:val="es-ES"/>
+              </w:rPr>
+              <w:t>, apellidos) </w:t>
+            </w:r>
+          </w:p>
+        </w:tc>
+        <w:tc>
+          <w:tcPr>
+            <w:tcW w:w="1282" w:type="dxa"/>
           </w:tcPr>
           <w:p>
             <w:pPr>
@@ -2144,6 +2372,7 @@
             </w:pPr>
             <w:proofErr w:type="spellStart"/>
             <w:r>
+              <w:lastRenderedPageBreak/>
               <w:t>Dirección</w:t>
             </w:r>
             <w:proofErr w:type="spellEnd"/>
@@ -2152,6 +2381,7 @@
             </w:r>
             <w:proofErr w:type="spellStart"/>
             <w:r>
+              <w:lastRenderedPageBreak/>
               <w:t>entrega</w:t>
             </w:r>
             <w:proofErr w:type="spellEnd"/>
@@ -2167,57 +2397,7 @@
         </w:tc>
         <w:tc>
           <w:tcPr>
-            <w:tcW w:w="1491" w:type="dxa"/>
-          </w:tcPr>
-          <w:p>
-            <w:pPr>
-              <w:rPr>
-                <w:lang w:val="es-ES"/>
-              </w:rPr>
-            </w:pPr>
-            <w:r>
-              <w:rPr>
-                <w:lang w:val="es-ES"/>
-              </w:rPr>
-              <w:t xml:space="preserve">Modelo asociado a la reparación </w:t>
-            </w:r>
-          </w:p>
-        </w:tc>
-        <w:tc>
-          <w:tcPr>
-            <w:tcW w:w="1460" w:type="dxa"/>
-          </w:tcPr>
-          <w:p>
-            <w:pPr>
-              <w:rPr>
-                <w:lang w:val="es-ES"/>
-              </w:rPr>
-            </w:pPr>
-            <w:r>
-              <w:rPr>
-                <w:lang w:val="es-ES"/>
-              </w:rPr>
-              <w:t>Método pago: “Efectivo” o “PayPal” (parámetro de teoría) </w:t>
-            </w:r>
-          </w:p>
-          <w:p>
-            <w:pPr>
-              <w:rPr>
-                <w:lang w:val="es-ES"/>
-              </w:rPr>
-            </w:pPr>
-          </w:p>
-          <w:p>
-            <w:pPr>
-              <w:rPr>
-                <w:lang w:val="es-ES"/>
-              </w:rPr>
-            </w:pPr>
-          </w:p>
-        </w:tc>
-        <w:tc>
-          <w:tcPr>
-            <w:tcW w:w="2266" w:type="dxa"/>
+            <w:tcW w:w="1688" w:type="dxa"/>
           </w:tcPr>
           <w:p>
             <w:pPr>
@@ -2230,15 +2410,252 @@
                 <w:lang w:val="es-ES"/>
               </w:rPr>
               <w:lastRenderedPageBreak/>
-              <w:t>Se crea correctamente el recibo con sus respectivos datos</w:t>
-            </w:r>
+              <w:t xml:space="preserve">Modelo </w:t>
+            </w:r>
+            <w:r>
+              <w:rPr>
+                <w:lang w:val="es-ES"/>
+              </w:rPr>
+              <w:lastRenderedPageBreak/>
+              <w:t xml:space="preserve">asociado a la reparación </w:t>
+            </w:r>
+          </w:p>
+        </w:tc>
+        <w:tc>
+          <w:tcPr>
+            <w:tcW w:w="1108" w:type="dxa"/>
+          </w:tcPr>
+          <w:p>
+            <w:pPr>
+              <w:rPr>
+                <w:lang w:val="es-ES"/>
+              </w:rPr>
+            </w:pPr>
+            <w:r>
+              <w:rPr>
+                <w:lang w:val="es-ES"/>
+              </w:rPr>
+              <w:lastRenderedPageBreak/>
+              <w:t>Métod</w:t>
+            </w:r>
+            <w:r>
+              <w:rPr>
+                <w:lang w:val="es-ES"/>
+              </w:rPr>
+              <w:t xml:space="preserve">o </w:t>
+            </w:r>
+            <w:r>
+              <w:rPr>
+                <w:lang w:val="es-ES"/>
+              </w:rPr>
+              <w:lastRenderedPageBreak/>
+              <w:t xml:space="preserve">de pago </w:t>
+            </w:r>
+            <w:r>
+              <w:rPr>
+                <w:lang w:val="es-ES"/>
+              </w:rPr>
+              <w:t xml:space="preserve">“PayPal” </w:t>
+            </w:r>
+          </w:p>
+          <w:p>
+            <w:pPr>
+              <w:rPr>
+                <w:lang w:val="es-ES"/>
+              </w:rPr>
+            </w:pPr>
+          </w:p>
+          <w:p>
+            <w:pPr>
+              <w:rPr>
+                <w:lang w:val="es-ES"/>
+              </w:rPr>
+            </w:pPr>
+          </w:p>
+        </w:tc>
+        <w:tc>
+          <w:tcPr>
+            <w:tcW w:w="2011" w:type="dxa"/>
+          </w:tcPr>
+          <w:p>
+            <w:pPr>
+              <w:rPr>
+                <w:lang w:val="es-ES"/>
+              </w:rPr>
+            </w:pPr>
+            <w:r>
+              <w:rPr>
+                <w:lang w:val="es-ES"/>
+              </w:rPr>
+              <w:lastRenderedPageBreak/>
+              <w:t>“</w:t>
+            </w:r>
+            <w:proofErr w:type="spellStart"/>
+            <w:r>
+              <w:rPr>
+                <w:lang w:val="es-ES"/>
+              </w:rPr>
+              <w:t>Details</w:t>
+            </w:r>
+            <w:proofErr w:type="spellEnd"/>
+            <w:r>
+              <w:rPr>
+                <w:lang w:val="es-ES"/>
+              </w:rPr>
+              <w:t xml:space="preserve">” – </w:t>
+            </w:r>
+            <w:r>
+              <w:rPr>
+                <w:lang w:val="es-ES"/>
+              </w:rPr>
+              <w:lastRenderedPageBreak/>
+              <w:t>AppForSEII2526, “</w:t>
+            </w:r>
+            <w:proofErr w:type="spellStart"/>
+            <w:r>
+              <w:rPr>
+                <w:lang w:val="es-ES"/>
+              </w:rPr>
+              <w:t>Details</w:t>
+            </w:r>
+            <w:proofErr w:type="spellEnd"/>
+            <w:r>
+              <w:rPr>
+                <w:lang w:val="es-ES"/>
+              </w:rPr>
+              <w:t>”</w:t>
+            </w:r>
+          </w:p>
+          <w:p>
+            <w:pPr>
+              <w:rPr>
+                <w:lang w:val="es-ES"/>
+              </w:rPr>
+            </w:pPr>
+            <w:r>
+              <w:rPr>
+                <w:lang w:val="es-ES"/>
+              </w:rPr>
+              <w:t>Luis</w:t>
+            </w:r>
+            <w:r>
+              <w:rPr>
+                <w:lang w:val="es-ES"/>
+              </w:rPr>
+              <w:t xml:space="preserve"> </w:t>
+            </w:r>
+            <w:r>
+              <w:rPr>
+                <w:lang w:val="es-ES"/>
+              </w:rPr>
+              <w:t xml:space="preserve">Lorenzo, Calle Mayor 5, </w:t>
+            </w:r>
+            <w:proofErr w:type="spellStart"/>
+            <w:r>
+              <w:rPr>
+                <w:lang w:val="es-ES"/>
+              </w:rPr>
+              <w:t>Paypal</w:t>
+            </w:r>
+            <w:proofErr w:type="spellEnd"/>
+            <w:r>
+              <w:rPr>
+                <w:lang w:val="es-ES"/>
+              </w:rPr>
+              <w:t xml:space="preserve">, 17/12/2025, </w:t>
+            </w:r>
+            <w:r>
+              <w:rPr>
+                <w:lang w:val="es-ES"/>
+              </w:rPr>
+              <w:t xml:space="preserve">reparación de sensor, Baja, </w:t>
+            </w:r>
+            <w:proofErr w:type="spellStart"/>
+            <w:r>
+              <w:rPr>
+                <w:lang w:val="es-ES"/>
+              </w:rPr>
+              <w:t>Iphone</w:t>
+            </w:r>
+            <w:proofErr w:type="spellEnd"/>
+            <w:r>
+              <w:rPr>
+                <w:lang w:val="es-ES"/>
+              </w:rPr>
+              <w:t>, 85.5</w:t>
+            </w:r>
+            <w:r>
+              <w:rPr>
+                <w:lang w:val="es-ES"/>
+              </w:rPr>
+              <w:t>€</w:t>
+            </w:r>
+          </w:p>
+          <w:p>
+            <w:pPr>
+              <w:rPr>
+                <w:lang w:val="es-ES"/>
+              </w:rPr>
+            </w:pPr>
+            <w:proofErr w:type="spellStart"/>
+            <w:r>
+              <w:rPr>
+                <w:lang w:val="es-ES"/>
+              </w:rPr>
+              <w:t>Calibracion</w:t>
+            </w:r>
+            <w:proofErr w:type="spellEnd"/>
+            <w:r>
+              <w:rPr>
+                <w:lang w:val="es-ES"/>
+              </w:rPr>
+              <w:t xml:space="preserve"> de precisión, Mediocre, Android, 45</w:t>
+            </w:r>
+            <w:r>
+              <w:rPr>
+                <w:lang w:val="es-ES"/>
+              </w:rPr>
+              <w:t>€</w:t>
+            </w:r>
+            <w:r>
+              <w:rPr>
+                <w:lang w:val="es-ES"/>
+              </w:rPr>
+              <w:t xml:space="preserve">, Total Price </w:t>
+            </w:r>
+            <w:r>
+              <w:rPr>
+                <w:u w:val="single"/>
+                <w:lang w:val="es-ES"/>
+              </w:rPr>
+              <w:t>130</w:t>
+            </w:r>
+            <w:r>
+              <w:rPr>
+                <w:lang w:val="es-ES"/>
+              </w:rPr>
+              <w:t>.5</w:t>
+            </w:r>
+            <w:r>
+              <w:rPr>
+                <w:lang w:val="es-ES"/>
+              </w:rPr>
+              <w:t>€</w:t>
+            </w:r>
+          </w:p>
+          <w:p>
+            <w:pPr>
+              <w:rPr>
+                <w:lang w:val="es-ES"/>
+              </w:rPr>
+            </w:pPr>
           </w:p>
         </w:tc>
       </w:tr>
       <w:tr>
         <w:tc>
           <w:tcPr>
-            <w:tcW w:w="1019" w:type="dxa"/>
+            <w:tcW w:w="662" w:type="dxa"/>
           </w:tcPr>
           <w:p>
             <w:pPr>
@@ -2254,37 +2671,32 @@
                 <w:bCs/>
                 <w:lang w:val="es-ES"/>
               </w:rPr>
+              <w:lastRenderedPageBreak/>
               <w:t>UC4-02</w:t>
             </w:r>
           </w:p>
         </w:tc>
         <w:tc>
           <w:tcPr>
-            <w:tcW w:w="2208" w:type="dxa"/>
-          </w:tcPr>
-          <w:p>
-            <w:pPr>
-              <w:rPr>
-                <w:lang w:val="es-ES"/>
-              </w:rPr>
-            </w:pPr>
-            <w:r>
-              <w:rPr>
-                <w:lang w:val="es-ES"/>
-              </w:rPr>
-              <w:t>Esc-2</w:t>
-            </w:r>
-            <w:r>
-              <w:rPr>
-                <w:lang w:val="es-ES"/>
-              </w:rPr>
-              <w:t>/Sin reparaciones disponibles</w:t>
-            </w:r>
-          </w:p>
-        </w:tc>
-        <w:tc>
-          <w:tcPr>
-            <w:tcW w:w="1518" w:type="dxa"/>
+            <w:tcW w:w="1845" w:type="dxa"/>
+          </w:tcPr>
+          <w:p>
+            <w:pPr>
+              <w:rPr>
+                <w:lang w:val="es-ES"/>
+              </w:rPr>
+            </w:pPr>
+            <w:r>
+              <w:rPr>
+                <w:lang w:val="es-ES"/>
+              </w:rPr>
+              <w:t>Esc-2/Sin reparaciones disponibles</w:t>
+            </w:r>
+          </w:p>
+        </w:tc>
+        <w:tc>
+          <w:tcPr>
+            <w:tcW w:w="3322" w:type="dxa"/>
           </w:tcPr>
           <w:p>
             <w:pPr>
@@ -2298,137 +2710,135 @@
               </w:rPr>
               <w:t>Criterio de búsqueda nombre: “</w:t>
             </w:r>
+            <w:r>
+              <w:rPr>
+                <w:lang w:val="es-ES"/>
+              </w:rPr>
+              <w:t>Nombre que no existe en la base de datos</w:t>
+            </w:r>
+            <w:r>
+              <w:rPr>
+                <w:lang w:val="es-ES"/>
+              </w:rPr>
+              <w:t>”</w:t>
+            </w:r>
+          </w:p>
+        </w:tc>
+        <w:tc>
+          <w:tcPr>
+            <w:tcW w:w="1258" w:type="dxa"/>
+          </w:tcPr>
+          <w:p>
+            <w:pPr>
+              <w:rPr>
+                <w:lang w:val="es-ES"/>
+              </w:rPr>
+            </w:pPr>
             <w:proofErr w:type="spellStart"/>
             <w:r>
-              <w:rPr>
-                <w:lang w:val="es-ES"/>
-              </w:rPr>
-              <w:t>NombreQueNoExisteEnLaBaseDatos</w:t>
+              <w:t>Filtro</w:t>
             </w:r>
             <w:proofErr w:type="spellEnd"/>
             <w:r>
-              <w:rPr>
-                <w:lang w:val="es-ES"/>
-              </w:rPr>
-              <w:t>”</w:t>
-            </w:r>
-          </w:p>
-        </w:tc>
-        <w:tc>
-          <w:tcPr>
-            <w:tcW w:w="1607" w:type="dxa"/>
-          </w:tcPr>
-          <w:p>
-            <w:pPr>
-              <w:rPr>
-                <w:lang w:val="es-ES"/>
-              </w:rPr>
-            </w:pPr>
+              <w:t xml:space="preserve"> de </w:t>
+            </w:r>
             <w:proofErr w:type="spellStart"/>
             <w:r>
-              <w:t>Filtro</w:t>
+              <w:t>escala</w:t>
             </w:r>
             <w:proofErr w:type="spellEnd"/>
             <w:r>
-              <w:t xml:space="preserve"> de </w:t>
-            </w:r>
+              <w:t>: “All” </w:t>
+            </w:r>
+          </w:p>
+        </w:tc>
+        <w:tc>
+          <w:tcPr>
+            <w:tcW w:w="1282" w:type="dxa"/>
+          </w:tcPr>
+          <w:p>
+            <w:pPr>
+              <w:rPr>
+                <w:lang w:val="es-ES"/>
+              </w:rPr>
+            </w:pPr>
+          </w:p>
+        </w:tc>
+        <w:tc>
+          <w:tcPr>
+            <w:tcW w:w="1688" w:type="dxa"/>
+          </w:tcPr>
+          <w:p>
+            <w:pPr>
+              <w:rPr>
+                <w:lang w:val="es-ES"/>
+              </w:rPr>
+            </w:pPr>
+          </w:p>
+        </w:tc>
+        <w:tc>
+          <w:tcPr>
+            <w:tcW w:w="1108" w:type="dxa"/>
+          </w:tcPr>
+          <w:p>
+            <w:pPr>
+              <w:rPr>
+                <w:lang w:val="es-ES"/>
+              </w:rPr>
+            </w:pPr>
+          </w:p>
+        </w:tc>
+        <w:tc>
+          <w:tcPr>
+            <w:tcW w:w="2011" w:type="dxa"/>
+          </w:tcPr>
+          <w:p>
+            <w:pPr>
+              <w:rPr>
+                <w:lang w:val="es-ES"/>
+              </w:rPr>
+            </w:pPr>
             <w:proofErr w:type="spellStart"/>
             <w:r>
-              <w:t>escala</w:t>
+              <w:rPr>
+                <w:lang w:val="es-ES"/>
+              </w:rPr>
+              <w:t>Errors</w:t>
             </w:r>
             <w:proofErr w:type="spellEnd"/>
             <w:r>
-              <w:t>: “All” </w:t>
-            </w:r>
-          </w:p>
-        </w:tc>
-        <w:tc>
-          <w:tcPr>
-            <w:tcW w:w="1607" w:type="dxa"/>
-          </w:tcPr>
-          <w:p>
-            <w:pPr>
-              <w:rPr>
-                <w:lang w:val="es-ES"/>
-              </w:rPr>
-            </w:pPr>
-          </w:p>
-        </w:tc>
-        <w:tc>
-          <w:tcPr>
-            <w:tcW w:w="1491" w:type="dxa"/>
-          </w:tcPr>
-          <w:p>
-            <w:pPr>
-              <w:rPr>
-                <w:lang w:val="es-ES"/>
-              </w:rPr>
-            </w:pPr>
-          </w:p>
-        </w:tc>
-        <w:tc>
-          <w:tcPr>
-            <w:tcW w:w="1460" w:type="dxa"/>
-          </w:tcPr>
-          <w:p>
-            <w:pPr>
-              <w:rPr>
-                <w:lang w:val="es-ES"/>
-              </w:rPr>
-            </w:pPr>
-          </w:p>
-        </w:tc>
-        <w:tc>
-          <w:tcPr>
-            <w:tcW w:w="2266" w:type="dxa"/>
-          </w:tcPr>
-          <w:p>
-            <w:pPr>
-              <w:rPr>
-                <w:lang w:val="es-ES"/>
-              </w:rPr>
-            </w:pPr>
-            <w:r>
-              <w:rPr>
-                <w:lang w:val="es-ES"/>
-              </w:rPr>
-              <w:t xml:space="preserve">Se muestra el mensaje de “No </w:t>
-            </w:r>
-            <w:proofErr w:type="spellStart"/>
-            <w:r>
-              <w:rPr>
-                <w:lang w:val="es-ES"/>
-              </w:rPr>
-              <w:t>repairs</w:t>
-            </w:r>
-            <w:proofErr w:type="spellEnd"/>
-            <w:r>
-              <w:rPr>
-                <w:lang w:val="es-ES"/>
-              </w:rPr>
-              <w:t xml:space="preserve"> </w:t>
-            </w:r>
-            <w:proofErr w:type="spellStart"/>
-            <w:r>
-              <w:rPr>
-                <w:lang w:val="es-ES"/>
-              </w:rPr>
-              <w:t>found</w:t>
-            </w:r>
-            <w:proofErr w:type="spellEnd"/>
-            <w:r>
-              <w:rPr>
-                <w:lang w:val="es-ES"/>
-              </w:rPr>
-              <w:t>” o la tabla de reparaciones aparece vacía. </w:t>
-            </w:r>
+              <w:rPr>
+                <w:lang w:val="es-ES"/>
+              </w:rPr>
+              <w:t>: </w:t>
+            </w:r>
+            <w:r>
+              <w:rPr>
+                <w:lang w:val="es-ES"/>
+              </w:rPr>
+              <w:t>No existe esa r</w:t>
+            </w:r>
+            <w:r>
+              <w:rPr>
+                <w:lang w:val="es-ES"/>
+              </w:rPr>
+              <w:t>eparación</w:t>
+            </w:r>
+          </w:p>
+          <w:p>
+            <w:pPr>
+              <w:rPr>
+                <w:u w:val="single"/>
+                <w:lang w:val="es-ES"/>
+              </w:rPr>
+            </w:pPr>
           </w:p>
         </w:tc>
       </w:tr>
       <w:tr>
         <w:tc>
           <w:tcPr>
-            <w:tcW w:w="1019" w:type="dxa"/>
+            <w:tcW w:w="662" w:type="dxa"/>
           </w:tcPr>
           <w:p>
             <w:pPr>
@@ -2450,31 +2860,25 @@
         </w:tc>
         <w:tc>
           <w:tcPr>
-            <w:tcW w:w="2208" w:type="dxa"/>
-          </w:tcPr>
-          <w:p>
-            <w:pPr>
-              <w:rPr>
-                <w:lang w:val="es-ES"/>
-              </w:rPr>
-            </w:pPr>
-            <w:r>
-              <w:rPr>
-                <w:lang w:val="es-ES"/>
-              </w:rPr>
-              <w:t>Esc-3</w:t>
-            </w:r>
-            <w:r>
-              <w:rPr>
-                <w:lang w:val="es-ES"/>
-              </w:rPr>
-              <w:t>/Filtro por Nombre</w:t>
-            </w:r>
-          </w:p>
-        </w:tc>
-        <w:tc>
-          <w:tcPr>
-            <w:tcW w:w="1518" w:type="dxa"/>
+            <w:tcW w:w="1845" w:type="dxa"/>
+          </w:tcPr>
+          <w:p>
+            <w:pPr>
+              <w:rPr>
+                <w:lang w:val="es-ES"/>
+              </w:rPr>
+            </w:pPr>
+            <w:r>
+              <w:rPr>
+                <w:lang w:val="es-ES"/>
+              </w:rPr>
+              <w:t>Esc-3/Filtro por Nombre</w:t>
+            </w:r>
+          </w:p>
+        </w:tc>
+        <w:tc>
+          <w:tcPr>
+            <w:tcW w:w="3322" w:type="dxa"/>
           </w:tcPr>
           <w:p>
             <w:pPr>
@@ -2492,7 +2896,7 @@
         </w:tc>
         <w:tc>
           <w:tcPr>
-            <w:tcW w:w="1607" w:type="dxa"/>
+            <w:tcW w:w="1258" w:type="dxa"/>
           </w:tcPr>
           <w:p>
             <w:pPr>
@@ -2520,83 +2924,62 @@
         </w:tc>
         <w:tc>
           <w:tcPr>
-            <w:tcW w:w="1607" w:type="dxa"/>
-          </w:tcPr>
-          <w:p>
-            <w:pPr>
-              <w:rPr>
-                <w:lang w:val="es-ES"/>
-              </w:rPr>
-            </w:pPr>
-          </w:p>
-        </w:tc>
-        <w:tc>
-          <w:tcPr>
-            <w:tcW w:w="1491" w:type="dxa"/>
-          </w:tcPr>
-          <w:p>
-            <w:pPr>
-              <w:rPr>
-                <w:lang w:val="es-ES"/>
-              </w:rPr>
-            </w:pPr>
-          </w:p>
-        </w:tc>
-        <w:tc>
-          <w:tcPr>
-            <w:tcW w:w="1460" w:type="dxa"/>
-          </w:tcPr>
-          <w:p>
-            <w:pPr>
-              <w:rPr>
-                <w:lang w:val="es-ES"/>
-              </w:rPr>
-            </w:pPr>
-          </w:p>
-        </w:tc>
-        <w:tc>
-          <w:tcPr>
-            <w:tcW w:w="2266" w:type="dxa"/>
-          </w:tcPr>
-          <w:p>
-            <w:pPr>
-              <w:rPr>
-                <w:lang w:val="es-ES"/>
-              </w:rPr>
-            </w:pPr>
-            <w:r>
-              <w:rPr>
-                <w:lang w:val="es-ES"/>
-              </w:rPr>
-              <w:t xml:space="preserve">La lista muestra al menos una reparación cuyo nombre contiene “sensor”; no se muestra mensaje de “no </w:t>
-            </w:r>
-            <w:proofErr w:type="spellStart"/>
-            <w:r>
-              <w:rPr>
-                <w:lang w:val="es-ES"/>
-              </w:rPr>
-              <w:t>repairs</w:t>
-            </w:r>
-            <w:proofErr w:type="spellEnd"/>
-            <w:r>
-              <w:rPr>
-                <w:lang w:val="es-ES"/>
-              </w:rPr>
-              <w:t xml:space="preserve"> </w:t>
-            </w:r>
-            <w:proofErr w:type="spellStart"/>
-            <w:r>
-              <w:rPr>
-                <w:lang w:val="es-ES"/>
-              </w:rPr>
-              <w:t>found</w:t>
-            </w:r>
-            <w:proofErr w:type="spellEnd"/>
-            <w:r>
-              <w:rPr>
-                <w:lang w:val="es-ES"/>
-              </w:rPr>
-              <w:t>”. </w:t>
+            <w:tcW w:w="1282" w:type="dxa"/>
+          </w:tcPr>
+          <w:p>
+            <w:pPr>
+              <w:rPr>
+                <w:lang w:val="es-ES"/>
+              </w:rPr>
+            </w:pPr>
+          </w:p>
+        </w:tc>
+        <w:tc>
+          <w:tcPr>
+            <w:tcW w:w="1688" w:type="dxa"/>
+          </w:tcPr>
+          <w:p>
+            <w:pPr>
+              <w:rPr>
+                <w:u w:val="single"/>
+                <w:lang w:val="es-ES"/>
+              </w:rPr>
+            </w:pPr>
+          </w:p>
+        </w:tc>
+        <w:tc>
+          <w:tcPr>
+            <w:tcW w:w="1108" w:type="dxa"/>
+          </w:tcPr>
+          <w:p>
+            <w:pPr>
+              <w:rPr>
+                <w:lang w:val="es-ES"/>
+              </w:rPr>
+            </w:pPr>
+          </w:p>
+        </w:tc>
+        <w:tc>
+          <w:tcPr>
+            <w:tcW w:w="2011" w:type="dxa"/>
+          </w:tcPr>
+          <w:p>
+            <w:pPr>
+              <w:rPr>
+                <w:lang w:val="es-ES"/>
+              </w:rPr>
+            </w:pPr>
+            <w:r>
+              <w:rPr>
+                <w:lang w:val="es-ES"/>
+              </w:rPr>
+              <w:t>Vista de carro: Reparación de sensor – 85.5</w:t>
+            </w:r>
+            <w:r>
+              <w:rPr>
+                <w:lang w:val="es-ES"/>
+              </w:rPr>
+              <w:t>€</w:t>
             </w:r>
           </w:p>
         </w:tc>
@@ -2604,7 +2987,7 @@
       <w:tr>
         <w:tc>
           <w:tcPr>
-            <w:tcW w:w="1019" w:type="dxa"/>
+            <w:tcW w:w="662" w:type="dxa"/>
           </w:tcPr>
           <w:p>
             <w:pPr>
@@ -2626,31 +3009,25 @@
         </w:tc>
         <w:tc>
           <w:tcPr>
-            <w:tcW w:w="2208" w:type="dxa"/>
-          </w:tcPr>
-          <w:p>
-            <w:pPr>
-              <w:rPr>
-                <w:lang w:val="es-ES"/>
-              </w:rPr>
-            </w:pPr>
-            <w:r>
-              <w:rPr>
-                <w:lang w:val="es-ES"/>
-              </w:rPr>
-              <w:t>Esc-3</w:t>
-            </w:r>
-            <w:r>
-              <w:rPr>
-                <w:lang w:val="es-ES"/>
-              </w:rPr>
-              <w:t>/Filtro por escala</w:t>
-            </w:r>
-          </w:p>
-        </w:tc>
-        <w:tc>
-          <w:tcPr>
-            <w:tcW w:w="1518" w:type="dxa"/>
+            <w:tcW w:w="1845" w:type="dxa"/>
+          </w:tcPr>
+          <w:p>
+            <w:pPr>
+              <w:rPr>
+                <w:lang w:val="es-ES"/>
+              </w:rPr>
+            </w:pPr>
+            <w:r>
+              <w:rPr>
+                <w:lang w:val="es-ES"/>
+              </w:rPr>
+              <w:t>Esc-3/Filtro por escala</w:t>
+            </w:r>
+          </w:p>
+        </w:tc>
+        <w:tc>
+          <w:tcPr>
+            <w:tcW w:w="3322" w:type="dxa"/>
           </w:tcPr>
           <w:p>
             <w:pPr>
@@ -2668,7 +3045,7 @@
         </w:tc>
         <w:tc>
           <w:tcPr>
-            <w:tcW w:w="1607" w:type="dxa"/>
+            <w:tcW w:w="1258" w:type="dxa"/>
           </w:tcPr>
           <w:p>
             <w:pPr>
@@ -2696,83 +3073,61 @@
         </w:tc>
         <w:tc>
           <w:tcPr>
-            <w:tcW w:w="1607" w:type="dxa"/>
-          </w:tcPr>
-          <w:p>
-            <w:pPr>
-              <w:rPr>
-                <w:lang w:val="es-ES"/>
-              </w:rPr>
-            </w:pPr>
-          </w:p>
-        </w:tc>
-        <w:tc>
-          <w:tcPr>
-            <w:tcW w:w="1491" w:type="dxa"/>
-          </w:tcPr>
-          <w:p>
-            <w:pPr>
-              <w:rPr>
-                <w:lang w:val="es-ES"/>
-              </w:rPr>
-            </w:pPr>
-          </w:p>
-        </w:tc>
-        <w:tc>
-          <w:tcPr>
-            <w:tcW w:w="1460" w:type="dxa"/>
-          </w:tcPr>
-          <w:p>
-            <w:pPr>
-              <w:rPr>
-                <w:lang w:val="es-ES"/>
-              </w:rPr>
-            </w:pPr>
-          </w:p>
-        </w:tc>
-        <w:tc>
-          <w:tcPr>
-            <w:tcW w:w="2266" w:type="dxa"/>
-          </w:tcPr>
-          <w:p>
-            <w:pPr>
-              <w:rPr>
-                <w:lang w:val="es-ES"/>
-              </w:rPr>
-            </w:pPr>
-            <w:r>
-              <w:rPr>
-                <w:lang w:val="es-ES"/>
-              </w:rPr>
-              <w:t xml:space="preserve">La lista muestra al menos una reparación con escala “Baja”; no se muestra mensaje de “no </w:t>
-            </w:r>
-            <w:proofErr w:type="spellStart"/>
-            <w:r>
-              <w:rPr>
-                <w:lang w:val="es-ES"/>
-              </w:rPr>
-              <w:t>repairs</w:t>
-            </w:r>
-            <w:proofErr w:type="spellEnd"/>
-            <w:r>
-              <w:rPr>
-                <w:lang w:val="es-ES"/>
-              </w:rPr>
-              <w:t xml:space="preserve"> </w:t>
-            </w:r>
-            <w:proofErr w:type="spellStart"/>
-            <w:r>
-              <w:rPr>
-                <w:lang w:val="es-ES"/>
-              </w:rPr>
-              <w:t>found</w:t>
-            </w:r>
-            <w:proofErr w:type="spellEnd"/>
-            <w:r>
-              <w:rPr>
-                <w:lang w:val="es-ES"/>
-              </w:rPr>
-              <w:t>”. </w:t>
+            <w:tcW w:w="1282" w:type="dxa"/>
+          </w:tcPr>
+          <w:p>
+            <w:pPr>
+              <w:rPr>
+                <w:lang w:val="es-ES"/>
+              </w:rPr>
+            </w:pPr>
+          </w:p>
+        </w:tc>
+        <w:tc>
+          <w:tcPr>
+            <w:tcW w:w="1688" w:type="dxa"/>
+          </w:tcPr>
+          <w:p>
+            <w:pPr>
+              <w:rPr>
+                <w:lang w:val="es-ES"/>
+              </w:rPr>
+            </w:pPr>
+          </w:p>
+        </w:tc>
+        <w:tc>
+          <w:tcPr>
+            <w:tcW w:w="1108" w:type="dxa"/>
+          </w:tcPr>
+          <w:p>
+            <w:pPr>
+              <w:rPr>
+                <w:lang w:val="es-ES"/>
+              </w:rPr>
+            </w:pPr>
+          </w:p>
+        </w:tc>
+        <w:tc>
+          <w:tcPr>
+            <w:tcW w:w="2011" w:type="dxa"/>
+          </w:tcPr>
+          <w:p>
+            <w:pPr>
+              <w:rPr>
+                <w:lang w:val="es-ES"/>
+              </w:rPr>
+            </w:pPr>
+            <w:r>
+              <w:rPr>
+                <w:lang w:val="es-ES"/>
+              </w:rPr>
+              <w:t>Vista de carro: Reparación de sensor – 85.5</w:t>
+            </w:r>
+            <w:r>
+              <w:rPr>
+                <w:lang w:val="es-ES"/>
+              </w:rPr>
+              <w:t>€</w:t>
             </w:r>
           </w:p>
         </w:tc>
@@ -2780,7 +3135,7 @@
       <w:tr>
         <w:tc>
           <w:tcPr>
-            <w:tcW w:w="1019" w:type="dxa"/>
+            <w:tcW w:w="662" w:type="dxa"/>
           </w:tcPr>
           <w:p>
             <w:pPr>
@@ -2802,31 +3157,25 @@
         </w:tc>
         <w:tc>
           <w:tcPr>
-            <w:tcW w:w="2208" w:type="dxa"/>
-          </w:tcPr>
-          <w:p>
-            <w:pPr>
-              <w:rPr>
-                <w:lang w:val="es-ES"/>
-              </w:rPr>
-            </w:pPr>
-            <w:r>
-              <w:rPr>
-                <w:lang w:val="es-ES"/>
-              </w:rPr>
-              <w:t>Esc-3</w:t>
-            </w:r>
-            <w:r>
-              <w:rPr>
-                <w:lang w:val="es-ES"/>
-              </w:rPr>
-              <w:t>/Filtro combinado</w:t>
-            </w:r>
-          </w:p>
-        </w:tc>
-        <w:tc>
-          <w:tcPr>
-            <w:tcW w:w="1518" w:type="dxa"/>
+            <w:tcW w:w="1845" w:type="dxa"/>
+          </w:tcPr>
+          <w:p>
+            <w:pPr>
+              <w:rPr>
+                <w:lang w:val="es-ES"/>
+              </w:rPr>
+            </w:pPr>
+            <w:r>
+              <w:rPr>
+                <w:lang w:val="es-ES"/>
+              </w:rPr>
+              <w:t>Esc-3/Filtro combinado</w:t>
+            </w:r>
+          </w:p>
+        </w:tc>
+        <w:tc>
+          <w:tcPr>
+            <w:tcW w:w="3322" w:type="dxa"/>
           </w:tcPr>
           <w:p>
             <w:pPr>
@@ -2844,7 +3193,7 @@
         </w:tc>
         <w:tc>
           <w:tcPr>
-            <w:tcW w:w="1607" w:type="dxa"/>
+            <w:tcW w:w="1258" w:type="dxa"/>
           </w:tcPr>
           <w:p>
             <w:pPr>
@@ -2872,84 +3221,61 @@
         </w:tc>
         <w:tc>
           <w:tcPr>
-            <w:tcW w:w="1607" w:type="dxa"/>
-          </w:tcPr>
-          <w:p>
-            <w:pPr>
-              <w:rPr>
-                <w:lang w:val="es-ES"/>
-              </w:rPr>
-            </w:pPr>
-          </w:p>
-        </w:tc>
-        <w:tc>
-          <w:tcPr>
-            <w:tcW w:w="1491" w:type="dxa"/>
-          </w:tcPr>
-          <w:p>
-            <w:pPr>
-              <w:rPr>
-                <w:lang w:val="es-ES"/>
-              </w:rPr>
-            </w:pPr>
-          </w:p>
-        </w:tc>
-        <w:tc>
-          <w:tcPr>
-            <w:tcW w:w="1460" w:type="dxa"/>
-          </w:tcPr>
-          <w:p>
-            <w:pPr>
-              <w:rPr>
-                <w:lang w:val="es-ES"/>
-              </w:rPr>
-            </w:pPr>
-          </w:p>
-        </w:tc>
-        <w:tc>
-          <w:tcPr>
-            <w:tcW w:w="2266" w:type="dxa"/>
-          </w:tcPr>
-          <w:p>
-            <w:pPr>
-              <w:jc w:val="center"/>
-              <w:rPr>
-                <w:lang w:val="es-ES"/>
-              </w:rPr>
-            </w:pPr>
-            <w:r>
-              <w:rPr>
-                <w:lang w:val="es-ES"/>
-              </w:rPr>
-              <w:t xml:space="preserve">La lista muestra al menos una reparación que cumple ambos filtros; no se muestra mensaje de “no </w:t>
-            </w:r>
-            <w:proofErr w:type="spellStart"/>
-            <w:r>
-              <w:rPr>
-                <w:lang w:val="es-ES"/>
-              </w:rPr>
-              <w:t>repairs</w:t>
-            </w:r>
-            <w:proofErr w:type="spellEnd"/>
-            <w:r>
-              <w:rPr>
-                <w:lang w:val="es-ES"/>
-              </w:rPr>
-              <w:t xml:space="preserve"> </w:t>
-            </w:r>
-            <w:proofErr w:type="spellStart"/>
-            <w:r>
-              <w:rPr>
-                <w:lang w:val="es-ES"/>
-              </w:rPr>
-              <w:t>found</w:t>
-            </w:r>
-            <w:proofErr w:type="spellEnd"/>
-            <w:r>
-              <w:rPr>
-                <w:lang w:val="es-ES"/>
-              </w:rPr>
-              <w:t>”. </w:t>
+            <w:tcW w:w="1282" w:type="dxa"/>
+          </w:tcPr>
+          <w:p>
+            <w:pPr>
+              <w:rPr>
+                <w:lang w:val="es-ES"/>
+              </w:rPr>
+            </w:pPr>
+          </w:p>
+        </w:tc>
+        <w:tc>
+          <w:tcPr>
+            <w:tcW w:w="1688" w:type="dxa"/>
+          </w:tcPr>
+          <w:p>
+            <w:pPr>
+              <w:rPr>
+                <w:lang w:val="es-ES"/>
+              </w:rPr>
+            </w:pPr>
+          </w:p>
+        </w:tc>
+        <w:tc>
+          <w:tcPr>
+            <w:tcW w:w="1108" w:type="dxa"/>
+          </w:tcPr>
+          <w:p>
+            <w:pPr>
+              <w:rPr>
+                <w:lang w:val="es-ES"/>
+              </w:rPr>
+            </w:pPr>
+          </w:p>
+        </w:tc>
+        <w:tc>
+          <w:tcPr>
+            <w:tcW w:w="2011" w:type="dxa"/>
+          </w:tcPr>
+          <w:p>
+            <w:pPr>
+              <w:rPr>
+                <w:lang w:val="es-ES"/>
+              </w:rPr>
+            </w:pPr>
+            <w:r>
+              <w:rPr>
+                <w:lang w:val="es-ES"/>
+              </w:rPr>
+              <w:t>Vista de carro: Reparación de sensor – 85.5</w:t>
+            </w:r>
+            <w:r>
+              <w:rPr>
+                <w:lang w:val="es-ES"/>
+              </w:rPr>
+              <w:t>€</w:t>
             </w:r>
           </w:p>
         </w:tc>
@@ -2957,7 +3283,7 @@
       <w:tr>
         <w:tc>
           <w:tcPr>
-            <w:tcW w:w="1019" w:type="dxa"/>
+            <w:tcW w:w="662" w:type="dxa"/>
           </w:tcPr>
           <w:p>
             <w:pPr>
@@ -2979,25 +3305,19 @@
         </w:tc>
         <w:tc>
           <w:tcPr>
-            <w:tcW w:w="2208" w:type="dxa"/>
-          </w:tcPr>
-          <w:p>
-            <w:pPr>
-              <w:rPr>
-                <w:lang w:val="es-ES"/>
-              </w:rPr>
-            </w:pPr>
-            <w:r>
-              <w:rPr>
-                <w:lang w:val="es-ES"/>
-              </w:rPr>
-              <w:t>Esc-4</w:t>
-            </w:r>
-            <w:r>
-              <w:rPr>
-                <w:lang w:val="es-ES"/>
-              </w:rPr>
-              <w:t xml:space="preserve">/Modificar carrito, eliminar una </w:t>
+            <w:tcW w:w="1845" w:type="dxa"/>
+          </w:tcPr>
+          <w:p>
+            <w:pPr>
+              <w:rPr>
+                <w:lang w:val="es-ES"/>
+              </w:rPr>
+            </w:pPr>
+            <w:r>
+              <w:rPr>
+                <w:lang w:val="es-ES"/>
+              </w:rPr>
+              <w:t xml:space="preserve">Esc-4/Modificar carrito, eliminar una </w:t>
             </w:r>
             <w:proofErr w:type="spellStart"/>
             <w:r>
@@ -3011,108 +3331,134 @@
         </w:tc>
         <w:tc>
           <w:tcPr>
-            <w:tcW w:w="1518" w:type="dxa"/>
-          </w:tcPr>
-          <w:p>
-            <w:pPr>
-              <w:rPr>
-                <w:lang w:val="es-ES"/>
-              </w:rPr>
-            </w:pPr>
-            <w:r>
-              <w:rPr>
-                <w:lang w:val="es-ES"/>
-              </w:rPr>
-              <w:t xml:space="preserve">Reparación añadida al carrito: </w:t>
-            </w:r>
-            <w:proofErr w:type="spellStart"/>
-            <w:r>
-              <w:rPr>
-                <w:lang w:val="es-ES"/>
-              </w:rPr>
-              <w:t>REPAIR_Reparaciones</w:t>
-            </w:r>
-            <w:proofErr w:type="spellEnd"/>
-            <w:r>
-              <w:rPr>
-                <w:lang w:val="es-ES"/>
-              </w:rPr>
-              <w:t xml:space="preserve"> añadidas al carrito: REPAIR_NAME_1 y </w:t>
-            </w:r>
-            <w:r>
-              <w:rPr>
-                <w:lang w:val="es-ES"/>
-              </w:rPr>
-              <w:lastRenderedPageBreak/>
-              <w:t>REPAIR_NAME_2 _1 </w:t>
-            </w:r>
-          </w:p>
-        </w:tc>
-        <w:tc>
-          <w:tcPr>
-            <w:tcW w:w="1607" w:type="dxa"/>
-          </w:tcPr>
-          <w:p>
-            <w:pPr>
-              <w:rPr>
-                <w:lang w:val="es-ES"/>
-              </w:rPr>
-            </w:pPr>
-            <w:r>
-              <w:rPr>
-                <w:lang w:val="es-ES"/>
-              </w:rPr>
-              <w:lastRenderedPageBreak/>
-              <w:t xml:space="preserve">Acción eliminar del carrito: REPAIR_NAME_1 (carrito </w:t>
-            </w:r>
-            <w:r>
-              <w:rPr>
-                <w:lang w:val="es-ES"/>
-              </w:rPr>
-              <w:lastRenderedPageBreak/>
-              <w:t>vacío)</w:t>
-            </w:r>
-          </w:p>
-        </w:tc>
-        <w:tc>
-          <w:tcPr>
-            <w:tcW w:w="1607" w:type="dxa"/>
-          </w:tcPr>
-          <w:p>
-            <w:pPr>
-              <w:rPr>
-                <w:lang w:val="es-ES"/>
-              </w:rPr>
-            </w:pPr>
-          </w:p>
-        </w:tc>
-        <w:tc>
-          <w:tcPr>
-            <w:tcW w:w="1491" w:type="dxa"/>
-          </w:tcPr>
-          <w:p>
-            <w:pPr>
-              <w:rPr>
-                <w:lang w:val="es-ES"/>
-              </w:rPr>
-            </w:pPr>
-          </w:p>
-        </w:tc>
-        <w:tc>
-          <w:tcPr>
-            <w:tcW w:w="1460" w:type="dxa"/>
-          </w:tcPr>
-          <w:p>
-            <w:pPr>
-              <w:rPr>
-                <w:lang w:val="es-ES"/>
-              </w:rPr>
-            </w:pPr>
-          </w:p>
-        </w:tc>
-        <w:tc>
-          <w:tcPr>
-            <w:tcW w:w="2266" w:type="dxa"/>
+            <w:tcW w:w="3322" w:type="dxa"/>
+          </w:tcPr>
+          <w:p>
+            <w:pPr>
+              <w:rPr>
+                <w:lang w:val="es-ES"/>
+              </w:rPr>
+            </w:pPr>
+            <w:r>
+              <w:rPr>
+                <w:lang w:val="es-ES"/>
+              </w:rPr>
+              <w:t>Reparaci</w:t>
+            </w:r>
+            <w:r>
+              <w:rPr>
+                <w:lang w:val="es-ES"/>
+              </w:rPr>
+              <w:t xml:space="preserve">ones </w:t>
+            </w:r>
+            <w:r>
+              <w:rPr>
+                <w:lang w:val="es-ES"/>
+              </w:rPr>
+              <w:t>añadida</w:t>
+            </w:r>
+            <w:r>
+              <w:rPr>
+                <w:lang w:val="es-ES"/>
+              </w:rPr>
+              <w:t>s</w:t>
+            </w:r>
+            <w:r>
+              <w:rPr>
+                <w:lang w:val="es-ES"/>
+              </w:rPr>
+              <w:t xml:space="preserve"> al carrito: </w:t>
+            </w:r>
+            <w:r>
+              <w:rPr>
+                <w:lang w:val="es-ES"/>
+              </w:rPr>
+              <w:t>Reparación de sensor, Reparación de pantalla</w:t>
+            </w:r>
+          </w:p>
+        </w:tc>
+        <w:tc>
+          <w:tcPr>
+            <w:tcW w:w="1258" w:type="dxa"/>
+          </w:tcPr>
+          <w:p>
+            <w:pPr>
+              <w:rPr>
+                <w:lang w:val="es-ES"/>
+              </w:rPr>
+            </w:pPr>
+            <w:r>
+              <w:rPr>
+                <w:lang w:val="es-ES"/>
+              </w:rPr>
+              <w:t>Acción</w:t>
+            </w:r>
+            <w:r>
+              <w:rPr>
+                <w:lang w:val="es-ES"/>
+              </w:rPr>
+              <w:t xml:space="preserve">, </w:t>
+            </w:r>
+            <w:r>
+              <w:rPr>
+                <w:lang w:val="es-ES"/>
+              </w:rPr>
+              <w:t xml:space="preserve">eliminar del carrito: </w:t>
+            </w:r>
+          </w:p>
+          <w:p>
+            <w:pPr>
+              <w:rPr>
+                <w:lang w:val="es-ES"/>
+              </w:rPr>
+            </w:pPr>
+            <w:r>
+              <w:rPr>
+                <w:lang w:val="es-ES"/>
+              </w:rPr>
+              <w:t>Reparación de sensor</w:t>
+            </w:r>
+          </w:p>
+        </w:tc>
+        <w:tc>
+          <w:tcPr>
+            <w:tcW w:w="1282" w:type="dxa"/>
+          </w:tcPr>
+          <w:p>
+            <w:pPr>
+              <w:rPr>
+                <w:lang w:val="es-ES"/>
+              </w:rPr>
+            </w:pPr>
+          </w:p>
+        </w:tc>
+        <w:tc>
+          <w:tcPr>
+            <w:tcW w:w="1688" w:type="dxa"/>
+          </w:tcPr>
+          <w:p>
+            <w:pPr>
+              <w:rPr>
+                <w:lang w:val="es-ES"/>
+              </w:rPr>
+            </w:pPr>
+          </w:p>
+        </w:tc>
+        <w:tc>
+          <w:tcPr>
+            <w:tcW w:w="1108" w:type="dxa"/>
+          </w:tcPr>
+          <w:p>
+            <w:pPr>
+              <w:rPr>
+                <w:lang w:val="es-ES"/>
+              </w:rPr>
+            </w:pPr>
+          </w:p>
+        </w:tc>
+        <w:tc>
+          <w:tcPr>
+            <w:tcW w:w="2011" w:type="dxa"/>
           </w:tcPr>
           <w:p>
             <w:pPr>
@@ -3146,7 +3492,7 @@
       <w:tr>
         <w:tc>
           <w:tcPr>
-            <w:tcW w:w="1019" w:type="dxa"/>
+            <w:tcW w:w="662" w:type="dxa"/>
           </w:tcPr>
           <w:p>
             <w:pPr>
@@ -3169,25 +3515,19 @@
         </w:tc>
         <w:tc>
           <w:tcPr>
-            <w:tcW w:w="2208" w:type="dxa"/>
-          </w:tcPr>
-          <w:p>
-            <w:pPr>
-              <w:rPr>
-                <w:lang w:val="es-ES"/>
-              </w:rPr>
-            </w:pPr>
-            <w:r>
-              <w:rPr>
-                <w:lang w:val="es-ES"/>
-              </w:rPr>
-              <w:t>Esc-4</w:t>
-            </w:r>
-            <w:r>
-              <w:rPr>
-                <w:lang w:val="es-ES"/>
-              </w:rPr>
-              <w:t xml:space="preserve">/Vaciar carrito desde </w:t>
+            <w:tcW w:w="1845" w:type="dxa"/>
+          </w:tcPr>
+          <w:p>
+            <w:pPr>
+              <w:rPr>
+                <w:lang w:val="es-ES"/>
+              </w:rPr>
+            </w:pPr>
+            <w:r>
+              <w:rPr>
+                <w:lang w:val="es-ES"/>
+              </w:rPr>
+              <w:t xml:space="preserve">Esc-4/Vaciar carrito desde </w:t>
             </w:r>
             <w:proofErr w:type="spellStart"/>
             <w:r>
@@ -3201,79 +3541,97 @@
         </w:tc>
         <w:tc>
           <w:tcPr>
-            <w:tcW w:w="1518" w:type="dxa"/>
-          </w:tcPr>
-          <w:p>
-            <w:pPr>
-              <w:rPr>
-                <w:lang w:val="es-ES"/>
-              </w:rPr>
-            </w:pPr>
-            <w:r>
-              <w:rPr>
-                <w:lang w:val="es-ES"/>
-              </w:rPr>
-              <w:t>Reparación añadida al carrito: REPAIR_NAME_1 </w:t>
-            </w:r>
-          </w:p>
-        </w:tc>
-        <w:tc>
-          <w:tcPr>
-            <w:tcW w:w="1607" w:type="dxa"/>
-          </w:tcPr>
-          <w:p>
-            <w:pPr>
-              <w:rPr>
-                <w:lang w:val="es-ES"/>
-              </w:rPr>
-            </w:pPr>
-            <w:r>
-              <w:rPr>
-                <w:lang w:val="es-ES"/>
-              </w:rPr>
-              <w:t>Acción eliminar del carrito: REPAIR_NAME_1 (carrito vacío) </w:t>
-            </w:r>
-          </w:p>
-        </w:tc>
-        <w:tc>
-          <w:tcPr>
-            <w:tcW w:w="1607" w:type="dxa"/>
-          </w:tcPr>
-          <w:p>
-            <w:pPr>
-              <w:rPr>
-                <w:lang w:val="es-ES"/>
-              </w:rPr>
-            </w:pPr>
-          </w:p>
-        </w:tc>
-        <w:tc>
-          <w:tcPr>
-            <w:tcW w:w="1491" w:type="dxa"/>
-          </w:tcPr>
-          <w:p>
-            <w:pPr>
-              <w:rPr>
-                <w:lang w:val="es-ES"/>
-              </w:rPr>
-            </w:pPr>
-          </w:p>
-        </w:tc>
-        <w:tc>
-          <w:tcPr>
-            <w:tcW w:w="1460" w:type="dxa"/>
-          </w:tcPr>
-          <w:p>
-            <w:pPr>
-              <w:rPr>
-                <w:lang w:val="es-ES"/>
-              </w:rPr>
-            </w:pPr>
-          </w:p>
-        </w:tc>
-        <w:tc>
-          <w:tcPr>
-            <w:tcW w:w="2266" w:type="dxa"/>
+            <w:tcW w:w="3322" w:type="dxa"/>
+          </w:tcPr>
+          <w:p>
+            <w:pPr>
+              <w:rPr>
+                <w:lang w:val="es-ES"/>
+              </w:rPr>
+            </w:pPr>
+            <w:r>
+              <w:rPr>
+                <w:lang w:val="es-ES"/>
+              </w:rPr>
+              <w:t xml:space="preserve">Reparación añadida al carrito: </w:t>
+            </w:r>
+            <w:r>
+              <w:rPr>
+                <w:lang w:val="es-ES"/>
+              </w:rPr>
+              <w:t>Reparación de sensor</w:t>
+            </w:r>
+          </w:p>
+        </w:tc>
+        <w:tc>
+          <w:tcPr>
+            <w:tcW w:w="1258" w:type="dxa"/>
+          </w:tcPr>
+          <w:p>
+            <w:pPr>
+              <w:rPr>
+                <w:lang w:val="es-ES"/>
+              </w:rPr>
+            </w:pPr>
+            <w:r>
+              <w:rPr>
+                <w:lang w:val="es-ES"/>
+              </w:rPr>
+              <w:t xml:space="preserve">Acción eliminar del carrito: </w:t>
+            </w:r>
+            <w:r>
+              <w:rPr>
+                <w:lang w:val="es-ES"/>
+              </w:rPr>
+              <w:t>reparación de sensor</w:t>
+            </w:r>
+            <w:r>
+              <w:rPr>
+                <w:lang w:val="es-ES"/>
+              </w:rPr>
+              <w:t> </w:t>
+            </w:r>
+          </w:p>
+        </w:tc>
+        <w:tc>
+          <w:tcPr>
+            <w:tcW w:w="1282" w:type="dxa"/>
+          </w:tcPr>
+          <w:p>
+            <w:pPr>
+              <w:rPr>
+                <w:lang w:val="es-ES"/>
+              </w:rPr>
+            </w:pPr>
+          </w:p>
+        </w:tc>
+        <w:tc>
+          <w:tcPr>
+            <w:tcW w:w="1688" w:type="dxa"/>
+          </w:tcPr>
+          <w:p>
+            <w:pPr>
+              <w:rPr>
+                <w:lang w:val="es-ES"/>
+              </w:rPr>
+            </w:pPr>
+          </w:p>
+        </w:tc>
+        <w:tc>
+          <w:tcPr>
+            <w:tcW w:w="1108" w:type="dxa"/>
+          </w:tcPr>
+          <w:p>
+            <w:pPr>
+              <w:rPr>
+                <w:lang w:val="es-ES"/>
+              </w:rPr>
+            </w:pPr>
+          </w:p>
+        </w:tc>
+        <w:tc>
+          <w:tcPr>
+            <w:tcW w:w="2011" w:type="dxa"/>
           </w:tcPr>
           <w:p>
             <w:pPr>
@@ -3293,7 +3651,7 @@
       <w:tr>
         <w:tc>
           <w:tcPr>
-            <w:tcW w:w="1019" w:type="dxa"/>
+            <w:tcW w:w="662" w:type="dxa"/>
           </w:tcPr>
           <w:p>
             <w:pPr>
@@ -3315,25 +3673,19 @@
         </w:tc>
         <w:tc>
           <w:tcPr>
-            <w:tcW w:w="2208" w:type="dxa"/>
-          </w:tcPr>
-          <w:p>
-            <w:pPr>
-              <w:rPr>
-                <w:lang w:val="es-ES"/>
-              </w:rPr>
-            </w:pPr>
-            <w:r>
-              <w:rPr>
-                <w:lang w:val="es-ES"/>
-              </w:rPr>
-              <w:t>Esc-5</w:t>
-            </w:r>
-            <w:r>
-              <w:rPr>
-                <w:lang w:val="es-ES"/>
-              </w:rPr>
-              <w:t xml:space="preserve">/Carrito </w:t>
+            <w:tcW w:w="1845" w:type="dxa"/>
+          </w:tcPr>
+          <w:p>
+            <w:pPr>
+              <w:rPr>
+                <w:lang w:val="es-ES"/>
+              </w:rPr>
+            </w:pPr>
+            <w:r>
+              <w:rPr>
+                <w:lang w:val="es-ES"/>
+              </w:rPr>
+              <w:t xml:space="preserve">Esc-5/Carrito </w:t>
             </w:r>
             <w:proofErr w:type="spellStart"/>
             <w:r>
@@ -3347,19 +3699,32 @@
         </w:tc>
         <w:tc>
           <w:tcPr>
-            <w:tcW w:w="1518" w:type="dxa"/>
-          </w:tcPr>
-          <w:p>
-            <w:pPr>
-              <w:rPr>
-                <w:lang w:val="es-ES"/>
-              </w:rPr>
-            </w:pPr>
-            <w:r>
-              <w:rPr>
-                <w:lang w:val="es-ES"/>
-              </w:rPr>
-              <w:t>Búsqueda general de reparaciones: nombre “”, escala “</w:t>
+            <w:tcW w:w="3322" w:type="dxa"/>
+          </w:tcPr>
+          <w:p>
+            <w:pPr>
+              <w:rPr>
+                <w:lang w:val="es-ES"/>
+              </w:rPr>
+            </w:pPr>
+            <w:r>
+              <w:rPr>
+                <w:lang w:val="es-ES"/>
+              </w:rPr>
+              <w:t xml:space="preserve">Búsqueda general de reparaciones: </w:t>
+            </w:r>
+            <w:r>
+              <w:rPr>
+                <w:u w:val="single"/>
+                <w:lang w:val="es-ES"/>
+              </w:rPr>
+              <w:t>nombre</w:t>
+            </w:r>
+            <w:r>
+              <w:rPr>
+                <w:lang w:val="es-ES"/>
+              </w:rPr>
+              <w:t xml:space="preserve"> “”, escala “</w:t>
             </w:r>
             <w:proofErr w:type="spellStart"/>
             <w:r>
@@ -3379,7 +3744,7 @@
         </w:tc>
         <w:tc>
           <w:tcPr>
-            <w:tcW w:w="1607" w:type="dxa"/>
+            <w:tcW w:w="1258" w:type="dxa"/>
           </w:tcPr>
           <w:p>
             <w:pPr>
@@ -3397,43 +3762,43 @@
         </w:tc>
         <w:tc>
           <w:tcPr>
-            <w:tcW w:w="1607" w:type="dxa"/>
-          </w:tcPr>
-          <w:p>
-            <w:pPr>
-              <w:rPr>
-                <w:lang w:val="es-ES"/>
-              </w:rPr>
-            </w:pPr>
-          </w:p>
-        </w:tc>
-        <w:tc>
-          <w:tcPr>
-            <w:tcW w:w="1491" w:type="dxa"/>
-          </w:tcPr>
-          <w:p>
-            <w:pPr>
-              <w:rPr>
-                <w:lang w:val="es-ES"/>
-              </w:rPr>
-            </w:pPr>
-          </w:p>
-        </w:tc>
-        <w:tc>
-          <w:tcPr>
-            <w:tcW w:w="1460" w:type="dxa"/>
-          </w:tcPr>
-          <w:p>
-            <w:pPr>
-              <w:rPr>
-                <w:lang w:val="es-ES"/>
-              </w:rPr>
-            </w:pPr>
-          </w:p>
-        </w:tc>
-        <w:tc>
-          <w:tcPr>
-            <w:tcW w:w="2266" w:type="dxa"/>
+            <w:tcW w:w="1282" w:type="dxa"/>
+          </w:tcPr>
+          <w:p>
+            <w:pPr>
+              <w:rPr>
+                <w:lang w:val="es-ES"/>
+              </w:rPr>
+            </w:pPr>
+          </w:p>
+        </w:tc>
+        <w:tc>
+          <w:tcPr>
+            <w:tcW w:w="1688" w:type="dxa"/>
+          </w:tcPr>
+          <w:p>
+            <w:pPr>
+              <w:rPr>
+                <w:lang w:val="es-ES"/>
+              </w:rPr>
+            </w:pPr>
+          </w:p>
+        </w:tc>
+        <w:tc>
+          <w:tcPr>
+            <w:tcW w:w="1108" w:type="dxa"/>
+          </w:tcPr>
+          <w:p>
+            <w:pPr>
+              <w:rPr>
+                <w:lang w:val="es-ES"/>
+              </w:rPr>
+            </w:pPr>
+          </w:p>
+        </w:tc>
+        <w:tc>
+          <w:tcPr>
+            <w:tcW w:w="2011" w:type="dxa"/>
           </w:tcPr>
           <w:p>
             <w:pPr>
@@ -3475,7 +3840,7 @@
       <w:tr>
         <w:tc>
           <w:tcPr>
-            <w:tcW w:w="1019" w:type="dxa"/>
+            <w:tcW w:w="662" w:type="dxa"/>
           </w:tcPr>
           <w:p>
             <w:pPr>
@@ -3497,25 +3862,19 @@
         </w:tc>
         <w:tc>
           <w:tcPr>
-            <w:tcW w:w="2208" w:type="dxa"/>
-          </w:tcPr>
-          <w:p>
-            <w:pPr>
-              <w:rPr>
-                <w:lang w:val="es-ES"/>
-              </w:rPr>
-            </w:pPr>
-            <w:r>
-              <w:rPr>
-                <w:lang w:val="es-ES"/>
-              </w:rPr>
-              <w:t>Esc-6</w:t>
-            </w:r>
-            <w:r>
-              <w:rPr>
-                <w:lang w:val="es-ES"/>
-              </w:rPr>
-              <w:t xml:space="preserve"> / Nombre </w:t>
+            <w:tcW w:w="1845" w:type="dxa"/>
+          </w:tcPr>
+          <w:p>
+            <w:pPr>
+              <w:rPr>
+                <w:lang w:val="es-ES"/>
+              </w:rPr>
+            </w:pPr>
+            <w:r>
+              <w:rPr>
+                <w:lang w:val="es-ES"/>
+              </w:rPr>
+              <w:t xml:space="preserve">Esc-6 / Nombre </w:t>
             </w:r>
             <w:proofErr w:type="spellStart"/>
             <w:r>
@@ -3529,107 +3888,107 @@
         </w:tc>
         <w:tc>
           <w:tcPr>
-            <w:tcW w:w="1518" w:type="dxa"/>
-          </w:tcPr>
-          <w:p>
-            <w:pPr>
-              <w:rPr>
-                <w:lang w:val="es-ES"/>
-              </w:rPr>
-            </w:pPr>
+            <w:tcW w:w="3322" w:type="dxa"/>
+          </w:tcPr>
+          <w:p>
+            <w:pPr>
+              <w:rPr>
+                <w:lang w:val="es-ES"/>
+              </w:rPr>
+            </w:pPr>
+            <w:r>
+              <w:rPr>
+                <w:lang w:val="es-ES"/>
+              </w:rPr>
+              <w:t>Carrito con reparación de sensor </w:t>
+            </w:r>
+          </w:p>
+        </w:tc>
+        <w:tc>
+          <w:tcPr>
+            <w:tcW w:w="1258" w:type="dxa"/>
+          </w:tcPr>
+          <w:p>
+            <w:pPr>
+              <w:rPr>
+                <w:lang w:val="es-ES"/>
+              </w:rPr>
+            </w:pPr>
+            <w:r>
+              <w:t xml:space="preserve">Nombre </w:t>
+            </w:r>
             <w:proofErr w:type="spellStart"/>
             <w:r>
-              <w:t>Carrito</w:t>
+              <w:t>vacío</w:t>
             </w:r>
             <w:proofErr w:type="spellEnd"/>
             <w:r>
-              <w:t xml:space="preserve"> con REPAIR_NAME_1 </w:t>
-            </w:r>
-          </w:p>
-        </w:tc>
-        <w:tc>
-          <w:tcPr>
-            <w:tcW w:w="1607" w:type="dxa"/>
-          </w:tcPr>
-          <w:p>
-            <w:pPr>
-              <w:rPr>
-                <w:lang w:val="es-ES"/>
-              </w:rPr>
-            </w:pPr>
-            <w:r>
-              <w:t xml:space="preserve">Nombre </w:t>
+              <w:t xml:space="preserve">, </w:t>
             </w:r>
             <w:proofErr w:type="spellStart"/>
             <w:r>
-              <w:t>vacío</w:t>
+              <w:t>apellidos</w:t>
             </w:r>
             <w:proofErr w:type="spellEnd"/>
             <w:r>
-              <w:t xml:space="preserve">, </w:t>
-            </w:r>
+              <w:t xml:space="preserve"> “Lorenzo” </w:t>
+            </w:r>
+          </w:p>
+        </w:tc>
+        <w:tc>
+          <w:tcPr>
+            <w:tcW w:w="1282" w:type="dxa"/>
+          </w:tcPr>
+          <w:p>
+            <w:pPr>
+              <w:rPr>
+                <w:lang w:val="es-ES"/>
+              </w:rPr>
+            </w:pPr>
             <w:proofErr w:type="spellStart"/>
             <w:r>
-              <w:t>apellidos</w:t>
+              <w:t>Dirección</w:t>
             </w:r>
             <w:proofErr w:type="spellEnd"/>
             <w:r>
-              <w:t xml:space="preserve"> “Lorenzo” </w:t>
-            </w:r>
-          </w:p>
-        </w:tc>
-        <w:tc>
-          <w:tcPr>
-            <w:tcW w:w="1607" w:type="dxa"/>
-          </w:tcPr>
-          <w:p>
-            <w:pPr>
-              <w:rPr>
-                <w:lang w:val="es-ES"/>
-              </w:rPr>
-            </w:pPr>
+              <w:t xml:space="preserve"> “Calle Mayor 5” </w:t>
+            </w:r>
+          </w:p>
+        </w:tc>
+        <w:tc>
+          <w:tcPr>
+            <w:tcW w:w="1688" w:type="dxa"/>
+          </w:tcPr>
+          <w:p>
+            <w:pPr>
+              <w:rPr>
+                <w:lang w:val="es-ES"/>
+              </w:rPr>
+            </w:pPr>
+            <w:r>
+              <w:rPr>
+                <w:lang w:val="es-ES"/>
+              </w:rPr>
+              <w:t>Modelo para reparación de sensor: “</w:t>
+            </w:r>
             <w:proofErr w:type="spellStart"/>
             <w:r>
-              <w:t>Dirección</w:t>
+              <w:rPr>
+                <w:lang w:val="es-ES"/>
+              </w:rPr>
+              <w:t>Iphone</w:t>
             </w:r>
             <w:proofErr w:type="spellEnd"/>
             <w:r>
-              <w:t xml:space="preserve"> “Calle Mayor 5” </w:t>
-            </w:r>
-          </w:p>
-        </w:tc>
-        <w:tc>
-          <w:tcPr>
-            <w:tcW w:w="1491" w:type="dxa"/>
-          </w:tcPr>
-          <w:p>
-            <w:pPr>
-              <w:rPr>
-                <w:lang w:val="es-ES"/>
-              </w:rPr>
-            </w:pPr>
-            <w:r>
-              <w:t xml:space="preserve">Modelo </w:t>
-            </w:r>
-            <w:proofErr w:type="gramStart"/>
-            <w:r>
-              <w:t>para REPAIR</w:t>
-            </w:r>
-            <w:proofErr w:type="gramEnd"/>
-            <w:r>
-              <w:t>_NAME_1: “</w:t>
-            </w:r>
-            <w:proofErr w:type="spellStart"/>
-            <w:r>
-              <w:t>Iphone</w:t>
-            </w:r>
-            <w:proofErr w:type="spellEnd"/>
-            <w:r>
+              <w:rPr>
+                <w:lang w:val="es-ES"/>
+              </w:rPr>
               <w:t>” </w:t>
             </w:r>
             <w:r>
               <w:rPr>
                 <w:rFonts w:ascii="Arial" w:hAnsi="Arial" w:cs="Arial"/>
+                <w:lang w:val="es-ES"/>
               </w:rPr>
               <w:t>​</w:t>
             </w:r>
@@ -3637,7 +3996,7 @@
         </w:tc>
         <w:tc>
           <w:tcPr>
-            <w:tcW w:w="1460" w:type="dxa"/>
+            <w:tcW w:w="1108" w:type="dxa"/>
           </w:tcPr>
           <w:p>
             <w:pPr>
@@ -3662,83 +4021,40 @@
         </w:tc>
         <w:tc>
           <w:tcPr>
-            <w:tcW w:w="2266" w:type="dxa"/>
-          </w:tcPr>
-          <w:p>
-            <w:pPr>
-              <w:rPr>
-                <w:lang w:val="es-ES"/>
-              </w:rPr>
-            </w:pPr>
-            <w:r>
-              <w:rPr>
-                <w:lang w:val="es-ES"/>
-              </w:rPr>
-              <w:t>Al enviar, se permanece en la página de creación (URL /</w:t>
-            </w:r>
-            <w:proofErr w:type="spellStart"/>
-            <w:r>
-              <w:rPr>
-                <w:lang w:val="es-ES"/>
-              </w:rPr>
-              <w:t>receipt</w:t>
-            </w:r>
-            <w:proofErr w:type="spellEnd"/>
-            <w:r>
-              <w:rPr>
-                <w:lang w:val="es-ES"/>
-              </w:rPr>
-              <w:t>/</w:t>
-            </w:r>
-            <w:proofErr w:type="spellStart"/>
-            <w:r>
-              <w:rPr>
-                <w:lang w:val="es-ES"/>
-              </w:rPr>
-              <w:t>create</w:t>
-            </w:r>
-            <w:proofErr w:type="spellEnd"/>
-            <w:r>
-              <w:rPr>
-                <w:lang w:val="es-ES"/>
-              </w:rPr>
-              <w:t xml:space="preserve"> o /</w:t>
-            </w:r>
-            <w:proofErr w:type="spellStart"/>
-            <w:r>
-              <w:rPr>
-                <w:lang w:val="es-ES"/>
-              </w:rPr>
-              <w:t>receipts</w:t>
-            </w:r>
-            <w:proofErr w:type="spellEnd"/>
-            <w:r>
-              <w:rPr>
-                <w:lang w:val="es-ES"/>
-              </w:rPr>
-              <w:t>/</w:t>
-            </w:r>
-            <w:proofErr w:type="spellStart"/>
-            <w:r>
-              <w:rPr>
-                <w:lang w:val="es-ES"/>
-              </w:rPr>
-              <w:t>createreceipt</w:t>
-            </w:r>
-            <w:proofErr w:type="spellEnd"/>
-            <w:r>
-              <w:rPr>
-                <w:lang w:val="es-ES"/>
-              </w:rPr>
-              <w:t>) y/o se muestran errores de validación. </w:t>
-            </w:r>
+            <w:tcW w:w="2011" w:type="dxa"/>
+          </w:tcPr>
+          <w:p>
+            <w:pPr>
+              <w:rPr>
+                <w:lang w:val="es-ES"/>
+              </w:rPr>
+            </w:pPr>
+            <w:r>
+              <w:rPr>
+                <w:lang w:val="es-ES"/>
+              </w:rPr>
+              <w:t xml:space="preserve">Mensaje: </w:t>
+            </w:r>
+            <w:r>
+              <w:rPr>
+                <w:lang w:val="es-ES"/>
+              </w:rPr>
+              <w:t>El nombre es obligatorio</w:t>
+            </w:r>
+          </w:p>
+          <w:p>
+            <w:pPr>
+              <w:rPr>
+                <w:lang w:val="es-ES"/>
+              </w:rPr>
+            </w:pPr>
           </w:p>
         </w:tc>
       </w:tr>
       <w:tr>
         <w:tc>
           <w:tcPr>
-            <w:tcW w:w="1019" w:type="dxa"/>
+            <w:tcW w:w="662" w:type="dxa"/>
           </w:tcPr>
           <w:p>
             <w:pPr>
@@ -3760,25 +4076,19 @@
         </w:tc>
         <w:tc>
           <w:tcPr>
-            <w:tcW w:w="2208" w:type="dxa"/>
-          </w:tcPr>
-          <w:p>
-            <w:pPr>
-              <w:rPr>
-                <w:lang w:val="es-ES"/>
-              </w:rPr>
-            </w:pPr>
-            <w:r>
-              <w:rPr>
-                <w:lang w:val="es-ES"/>
-              </w:rPr>
-              <w:t>Esc-6</w:t>
-            </w:r>
-            <w:r>
-              <w:rPr>
-                <w:lang w:val="es-ES"/>
-              </w:rPr>
-              <w:t xml:space="preserve"> / Apellidos </w:t>
+            <w:tcW w:w="1845" w:type="dxa"/>
+          </w:tcPr>
+          <w:p>
+            <w:pPr>
+              <w:rPr>
+                <w:lang w:val="es-ES"/>
+              </w:rPr>
+            </w:pPr>
+            <w:r>
+              <w:rPr>
+                <w:lang w:val="es-ES"/>
+              </w:rPr>
+              <w:t xml:space="preserve">Esc-6 / Apellidos </w:t>
             </w:r>
             <w:proofErr w:type="spellStart"/>
             <w:r>
@@ -3792,109 +4102,120 @@
         </w:tc>
         <w:tc>
           <w:tcPr>
-            <w:tcW w:w="1518" w:type="dxa"/>
-          </w:tcPr>
-          <w:p>
-            <w:pPr>
-              <w:rPr>
-                <w:lang w:val="es-ES"/>
-              </w:rPr>
-            </w:pPr>
+            <w:tcW w:w="3322" w:type="dxa"/>
+          </w:tcPr>
+          <w:p>
+            <w:pPr>
+              <w:rPr>
+                <w:lang w:val="es-ES"/>
+              </w:rPr>
+            </w:pPr>
+            <w:r>
+              <w:rPr>
+                <w:lang w:val="es-ES"/>
+              </w:rPr>
+              <w:t>Carrito con reparación de sensor </w:t>
+            </w:r>
+          </w:p>
+        </w:tc>
+        <w:tc>
+          <w:tcPr>
+            <w:tcW w:w="1258" w:type="dxa"/>
+          </w:tcPr>
+          <w:p>
+            <w:pPr>
+              <w:rPr>
+                <w:lang w:val="es-ES"/>
+              </w:rPr>
+            </w:pPr>
+            <w:r>
+              <w:t xml:space="preserve">Nombre “Luis”, </w:t>
+            </w:r>
             <w:proofErr w:type="spellStart"/>
             <w:r>
-              <w:t>Carrito</w:t>
+              <w:t>apellidos</w:t>
             </w:r>
             <w:proofErr w:type="spellEnd"/>
             <w:r>
-              <w:t xml:space="preserve"> con REPAIR_NAME_1 </w:t>
-            </w:r>
-          </w:p>
-        </w:tc>
-        <w:tc>
-          <w:tcPr>
-            <w:tcW w:w="1607" w:type="dxa"/>
-          </w:tcPr>
-          <w:p>
-            <w:pPr>
-              <w:rPr>
-                <w:lang w:val="es-ES"/>
-              </w:rPr>
-            </w:pPr>
-            <w:r>
-              <w:t xml:space="preserve">Nombre “Luis”, </w:t>
+              <w:t xml:space="preserve"> </w:t>
             </w:r>
             <w:proofErr w:type="spellStart"/>
             <w:r>
-              <w:t>apellidos</w:t>
+              <w:t>vacíos</w:t>
             </w:r>
             <w:proofErr w:type="spellEnd"/>
             <w:r>
-              <w:t xml:space="preserve"> </w:t>
-            </w:r>
+              <w:t> </w:t>
+            </w:r>
+          </w:p>
+        </w:tc>
+        <w:tc>
+          <w:tcPr>
+            <w:tcW w:w="1282" w:type="dxa"/>
+          </w:tcPr>
+          <w:p>
+            <w:pPr>
+              <w:rPr>
+                <w:lang w:val="es-ES"/>
+              </w:rPr>
+            </w:pPr>
             <w:proofErr w:type="spellStart"/>
             <w:r>
-              <w:t>vacíos</w:t>
+              <w:t>Dirección</w:t>
             </w:r>
             <w:proofErr w:type="spellEnd"/>
             <w:r>
-              <w:t> </w:t>
-            </w:r>
-          </w:p>
-        </w:tc>
-        <w:tc>
-          <w:tcPr>
-            <w:tcW w:w="1607" w:type="dxa"/>
-          </w:tcPr>
-          <w:p>
-            <w:pPr>
-              <w:rPr>
-                <w:lang w:val="es-ES"/>
-              </w:rPr>
-            </w:pPr>
+              <w:t xml:space="preserve"> “Calle Mayor 5” </w:t>
+            </w:r>
+          </w:p>
+        </w:tc>
+        <w:tc>
+          <w:tcPr>
+            <w:tcW w:w="1688" w:type="dxa"/>
+          </w:tcPr>
+          <w:p>
+            <w:pPr>
+              <w:rPr>
+                <w:lang w:val="es-ES"/>
+              </w:rPr>
+            </w:pPr>
+            <w:r>
+              <w:rPr>
+                <w:lang w:val="es-ES"/>
+              </w:rPr>
+              <w:t xml:space="preserve">Modelo para </w:t>
+            </w:r>
+            <w:r>
+              <w:rPr>
+                <w:lang w:val="es-ES"/>
+              </w:rPr>
+              <w:t>reparación de sensor</w:t>
+            </w:r>
+            <w:r>
+              <w:rPr>
+                <w:lang w:val="es-ES"/>
+              </w:rPr>
+              <w:t>: “</w:t>
+            </w:r>
             <w:proofErr w:type="spellStart"/>
             <w:r>
-              <w:t>Dirección</w:t>
+              <w:rPr>
+                <w:lang w:val="es-ES"/>
+              </w:rPr>
+              <w:t>Iphone</w:t>
             </w:r>
             <w:proofErr w:type="spellEnd"/>
             <w:r>
-              <w:t xml:space="preserve"> “Calle Mayor 5” </w:t>
-            </w:r>
-          </w:p>
-        </w:tc>
-        <w:tc>
-          <w:tcPr>
-            <w:tcW w:w="1491" w:type="dxa"/>
-          </w:tcPr>
-          <w:p>
-            <w:pPr>
-              <w:rPr>
-                <w:lang w:val="es-ES"/>
-              </w:rPr>
-            </w:pPr>
-            <w:r>
-              <w:t xml:space="preserve">Modelo </w:t>
-            </w:r>
-            <w:proofErr w:type="gramStart"/>
-            <w:r>
-              <w:t>para REPAIR</w:t>
-            </w:r>
-            <w:proofErr w:type="gramEnd"/>
-            <w:r>
-              <w:t>_NAME_1: “</w:t>
-            </w:r>
-            <w:proofErr w:type="spellStart"/>
-            <w:r>
-              <w:t>Iphone</w:t>
-            </w:r>
-            <w:proofErr w:type="spellEnd"/>
-            <w:r>
+              <w:rPr>
+                <w:lang w:val="es-ES"/>
+              </w:rPr>
               <w:t>” </w:t>
             </w:r>
           </w:p>
         </w:tc>
         <w:tc>
           <w:tcPr>
-            <w:tcW w:w="1460" w:type="dxa"/>
+            <w:tcW w:w="1108" w:type="dxa"/>
           </w:tcPr>
           <w:p>
             <w:pPr>
@@ -3912,27 +4233,40 @@
         </w:tc>
         <w:tc>
           <w:tcPr>
-            <w:tcW w:w="2266" w:type="dxa"/>
-          </w:tcPr>
-          <w:p>
-            <w:pPr>
-              <w:rPr>
-                <w:lang w:val="es-ES"/>
-              </w:rPr>
-            </w:pPr>
-            <w:r>
-              <w:rPr>
-                <w:lang w:val="es-ES"/>
-              </w:rPr>
-              <w:t>Al enviar, se permanece en la página de creación y/o se muestran errores de validación por falta de apellidos. </w:t>
-            </w:r>
+            <w:tcW w:w="2011" w:type="dxa"/>
+          </w:tcPr>
+          <w:p>
+            <w:pPr>
+              <w:rPr>
+                <w:lang w:val="es-ES"/>
+              </w:rPr>
+            </w:pPr>
+            <w:r>
+              <w:rPr>
+                <w:lang w:val="es-ES"/>
+              </w:rPr>
+              <w:t xml:space="preserve">Mensaje: </w:t>
+            </w:r>
+            <w:r>
+              <w:rPr>
+                <w:lang w:val="es-ES"/>
+              </w:rPr>
+              <w:t>El apellido es obligatorio</w:t>
+            </w:r>
+          </w:p>
+          <w:p>
+            <w:pPr>
+              <w:rPr>
+                <w:lang w:val="es-ES"/>
+              </w:rPr>
+            </w:pPr>
           </w:p>
         </w:tc>
       </w:tr>
       <w:tr>
         <w:tc>
           <w:tcPr>
-            <w:tcW w:w="1019" w:type="dxa"/>
+            <w:tcW w:w="662" w:type="dxa"/>
           </w:tcPr>
           <w:p>
             <w:pPr>
@@ -3948,113 +4282,321 @@
                 <w:bCs/>
                 <w:lang w:val="es-ES"/>
               </w:rPr>
-              <w:t>UC4-</w:t>
-            </w:r>
-            <w:r>
+              <w:t>UC4-08c</w:t>
+            </w:r>
+          </w:p>
+        </w:tc>
+        <w:tc>
+          <w:tcPr>
+            <w:tcW w:w="1845" w:type="dxa"/>
+          </w:tcPr>
+          <w:p>
+            <w:pPr>
+              <w:rPr>
+                <w:lang w:val="es-ES"/>
+              </w:rPr>
+            </w:pPr>
+            <w:r>
+              <w:rPr>
+                <w:lang w:val="es-ES"/>
+              </w:rPr>
+              <w:t xml:space="preserve">Esc-6 / </w:t>
+            </w:r>
+            <w:proofErr w:type="spellStart"/>
+            <w:r>
+              <w:rPr>
+                <w:lang w:val="es-ES"/>
+              </w:rPr>
+              <w:t>Direccion</w:t>
+            </w:r>
+            <w:proofErr w:type="spellEnd"/>
+            <w:r>
+              <w:rPr>
+                <w:lang w:val="es-ES"/>
+              </w:rPr>
+              <w:t xml:space="preserve"> </w:t>
+            </w:r>
+            <w:proofErr w:type="spellStart"/>
+            <w:r>
+              <w:rPr>
+                <w:lang w:val="es-ES"/>
+              </w:rPr>
+              <w:t>Vacia</w:t>
+            </w:r>
+            <w:proofErr w:type="spellEnd"/>
+          </w:p>
+        </w:tc>
+        <w:tc>
+          <w:tcPr>
+            <w:tcW w:w="3322" w:type="dxa"/>
+          </w:tcPr>
+          <w:p>
+            <w:pPr>
+              <w:rPr>
+                <w:lang w:val="es-ES"/>
+              </w:rPr>
+            </w:pPr>
+            <w:r>
+              <w:rPr>
+                <w:lang w:val="es-ES"/>
+              </w:rPr>
+              <w:t xml:space="preserve">Carrito con </w:t>
+            </w:r>
+            <w:r>
+              <w:rPr>
+                <w:lang w:val="es-ES"/>
+              </w:rPr>
+              <w:t>reparación de s</w:t>
+            </w:r>
+            <w:r>
+              <w:rPr>
+                <w:lang w:val="es-ES"/>
+              </w:rPr>
+              <w:t>ensor</w:t>
+            </w:r>
+          </w:p>
+        </w:tc>
+        <w:tc>
+          <w:tcPr>
+            <w:tcW w:w="1258" w:type="dxa"/>
+          </w:tcPr>
+          <w:p>
+            <w:pPr>
+              <w:rPr>
+                <w:lang w:val="es-ES"/>
+              </w:rPr>
+            </w:pPr>
+            <w:r>
+              <w:t xml:space="preserve">Nombre “Luis”, </w:t>
+            </w:r>
+            <w:proofErr w:type="spellStart"/>
+            <w:r>
+              <w:t>apellidos</w:t>
+            </w:r>
+            <w:proofErr w:type="spellEnd"/>
+            <w:r>
+              <w:t xml:space="preserve"> “Lorenzo” </w:t>
+            </w:r>
+          </w:p>
+        </w:tc>
+        <w:tc>
+          <w:tcPr>
+            <w:tcW w:w="1282" w:type="dxa"/>
+          </w:tcPr>
+          <w:p>
+            <w:pPr>
+              <w:rPr>
+                <w:lang w:val="es-ES"/>
+              </w:rPr>
+            </w:pPr>
+            <w:proofErr w:type="spellStart"/>
+            <w:r>
+              <w:t>Dirección</w:t>
+            </w:r>
+            <w:proofErr w:type="spellEnd"/>
+            <w:r>
+              <w:t xml:space="preserve"> </w:t>
+            </w:r>
+            <w:proofErr w:type="spellStart"/>
+            <w:r>
+              <w:t>vacía</w:t>
+            </w:r>
+            <w:proofErr w:type="spellEnd"/>
+            <w:r>
+              <w:t xml:space="preserve"> (“”) </w:t>
+            </w:r>
+          </w:p>
+        </w:tc>
+        <w:tc>
+          <w:tcPr>
+            <w:tcW w:w="1688" w:type="dxa"/>
+          </w:tcPr>
+          <w:p>
+            <w:pPr>
+              <w:rPr>
+                <w:lang w:val="es-ES"/>
+              </w:rPr>
+            </w:pPr>
+            <w:r>
+              <w:rPr>
+                <w:lang w:val="es-ES"/>
+              </w:rPr>
+              <w:t xml:space="preserve">Modelo para </w:t>
+            </w:r>
+            <w:r>
+              <w:rPr>
+                <w:lang w:val="es-ES"/>
+              </w:rPr>
+              <w:t>reparación de sensor</w:t>
+            </w:r>
+            <w:r>
+              <w:rPr>
+                <w:lang w:val="es-ES"/>
+              </w:rPr>
+              <w:t>: “</w:t>
+            </w:r>
+            <w:proofErr w:type="spellStart"/>
+            <w:r>
+              <w:rPr>
+                <w:lang w:val="es-ES"/>
+              </w:rPr>
+              <w:t>Iphone</w:t>
+            </w:r>
+            <w:proofErr w:type="spellEnd"/>
+            <w:r>
+              <w:rPr>
+                <w:lang w:val="es-ES"/>
+              </w:rPr>
+              <w:t>” </w:t>
+            </w:r>
+          </w:p>
+        </w:tc>
+        <w:tc>
+          <w:tcPr>
+            <w:tcW w:w="1108" w:type="dxa"/>
+          </w:tcPr>
+          <w:p>
+            <w:pPr>
+              <w:rPr>
+                <w:lang w:val="es-ES"/>
+              </w:rPr>
+            </w:pPr>
+            <w:r>
+              <w:rPr>
+                <w:lang w:val="es-ES"/>
+              </w:rPr>
+              <w:t>Método pago: “Tarjeta de Crédito” </w:t>
+            </w:r>
+          </w:p>
+        </w:tc>
+        <w:tc>
+          <w:tcPr>
+            <w:tcW w:w="2011" w:type="dxa"/>
+          </w:tcPr>
+          <w:p>
+            <w:pPr>
+              <w:rPr>
+                <w:lang w:val="es-ES"/>
+              </w:rPr>
+            </w:pPr>
+            <w:r>
+              <w:rPr>
+                <w:lang w:val="es-ES"/>
+              </w:rPr>
+              <w:t>Mensaje: La dirección de entrega es obligatoria</w:t>
+            </w:r>
+          </w:p>
+        </w:tc>
+      </w:tr>
+      <w:tr>
+        <w:tc>
+          <w:tcPr>
+            <w:tcW w:w="662" w:type="dxa"/>
+          </w:tcPr>
+          <w:p>
+            <w:pPr>
               <w:rPr>
                 <w:b/>
                 <w:bCs/>
                 <w:lang w:val="es-ES"/>
               </w:rPr>
+            </w:pPr>
+            <w:r>
+              <w:rPr>
+                <w:b/>
+                <w:bCs/>
+                <w:lang w:val="es-ES"/>
+              </w:rPr>
+              <w:t>UC4-08d</w:t>
+            </w:r>
+          </w:p>
+        </w:tc>
+        <w:tc>
+          <w:tcPr>
+            <w:tcW w:w="1845" w:type="dxa"/>
+          </w:tcPr>
+          <w:p>
+            <w:pPr>
+              <w:rPr>
+                <w:lang w:val="es-ES"/>
+              </w:rPr>
+            </w:pPr>
+            <w:r>
+              <w:rPr>
+                <w:lang w:val="es-ES"/>
+              </w:rPr>
+              <w:t xml:space="preserve">Esc-6 / Modelo </w:t>
+            </w:r>
+            <w:proofErr w:type="spellStart"/>
+            <w:r>
+              <w:rPr>
+                <w:lang w:val="es-ES"/>
+              </w:rPr>
+              <w:t>Vacio</w:t>
+            </w:r>
+            <w:proofErr w:type="spellEnd"/>
+          </w:p>
+        </w:tc>
+        <w:tc>
+          <w:tcPr>
+            <w:tcW w:w="3322" w:type="dxa"/>
+          </w:tcPr>
+          <w:p>
+            <w:pPr>
+              <w:rPr>
+                <w:lang w:val="es-ES"/>
+              </w:rPr>
+            </w:pPr>
+            <w:r>
+              <w:rPr>
+                <w:lang w:val="es-ES"/>
+              </w:rPr>
+              <w:t xml:space="preserve">Carrito con </w:t>
+            </w:r>
+            <w:r>
+              <w:rPr>
+                <w:lang w:val="es-ES"/>
+              </w:rPr>
+              <w:t>reparación de sensor</w:t>
+            </w:r>
+            <w:r>
+              <w:rPr>
+                <w:lang w:val="es-ES"/>
+              </w:rPr>
+              <w:t> </w:t>
+            </w:r>
+          </w:p>
+        </w:tc>
+        <w:tc>
+          <w:tcPr>
+            <w:tcW w:w="1258" w:type="dxa"/>
+          </w:tcPr>
+          <w:p>
+            <w:pPr>
+              <w:rPr>
+                <w:lang w:val="es-ES"/>
+              </w:rPr>
+            </w:pPr>
+            <w:r>
+              <w:t xml:space="preserve">Nombre “Luis”, </w:t>
+            </w:r>
+            <w:proofErr w:type="spellStart"/>
+            <w:r>
+              <w:t>apellidos</w:t>
+            </w:r>
+            <w:proofErr w:type="spellEnd"/>
+            <w:r>
+              <w:t xml:space="preserve"> </w:t>
+            </w:r>
+            <w:r>
               <w:lastRenderedPageBreak/>
-              <w:t>08c</w:t>
-            </w:r>
-          </w:p>
-        </w:tc>
-        <w:tc>
-          <w:tcPr>
-            <w:tcW w:w="2208" w:type="dxa"/>
-          </w:tcPr>
-          <w:p>
-            <w:pPr>
-              <w:rPr>
-                <w:lang w:val="es-ES"/>
-              </w:rPr>
-            </w:pPr>
-            <w:r>
-              <w:rPr>
-                <w:lang w:val="es-ES"/>
-              </w:rPr>
-              <w:lastRenderedPageBreak/>
-              <w:t>Esc-6</w:t>
-            </w:r>
-            <w:r>
-              <w:rPr>
-                <w:lang w:val="es-ES"/>
-              </w:rPr>
-              <w:t xml:space="preserve"> / </w:t>
-            </w:r>
-            <w:proofErr w:type="spellStart"/>
-            <w:r>
-              <w:rPr>
-                <w:lang w:val="es-ES"/>
-              </w:rPr>
-              <w:t>Direccion</w:t>
-            </w:r>
-            <w:proofErr w:type="spellEnd"/>
-            <w:r>
-              <w:rPr>
-                <w:lang w:val="es-ES"/>
-              </w:rPr>
-              <w:t xml:space="preserve"> </w:t>
-            </w:r>
-            <w:proofErr w:type="spellStart"/>
-            <w:r>
-              <w:rPr>
-                <w:lang w:val="es-ES"/>
-              </w:rPr>
-              <w:t>Vacia</w:t>
-            </w:r>
-            <w:proofErr w:type="spellEnd"/>
-          </w:p>
-        </w:tc>
-        <w:tc>
-          <w:tcPr>
-            <w:tcW w:w="1518" w:type="dxa"/>
-          </w:tcPr>
-          <w:p>
-            <w:pPr>
-              <w:rPr>
-                <w:lang w:val="es-ES"/>
-              </w:rPr>
-            </w:pPr>
-            <w:proofErr w:type="spellStart"/>
-            <w:r>
-              <w:t>Carrito</w:t>
-            </w:r>
-            <w:proofErr w:type="spellEnd"/>
-            <w:r>
-              <w:t xml:space="preserve"> con REPAIR_NAME_1 </w:t>
-            </w:r>
-          </w:p>
-        </w:tc>
-        <w:tc>
-          <w:tcPr>
-            <w:tcW w:w="1607" w:type="dxa"/>
-          </w:tcPr>
-          <w:p>
-            <w:pPr>
-              <w:rPr>
-                <w:lang w:val="es-ES"/>
-              </w:rPr>
-            </w:pPr>
-            <w:r>
-              <w:t xml:space="preserve">Nombre “Luis”, </w:t>
-            </w:r>
-            <w:proofErr w:type="spellStart"/>
-            <w:r>
-              <w:lastRenderedPageBreak/>
-              <w:t>apellidos</w:t>
-            </w:r>
-            <w:proofErr w:type="spellEnd"/>
-            <w:r>
-              <w:t xml:space="preserve"> “Lorenzo” </w:t>
-            </w:r>
-          </w:p>
-        </w:tc>
-        <w:tc>
-          <w:tcPr>
-            <w:tcW w:w="1607" w:type="dxa"/>
+              <w:t>“Lorenzo” </w:t>
+            </w:r>
+          </w:p>
+        </w:tc>
+        <w:tc>
+          <w:tcPr>
+            <w:tcW w:w="1282" w:type="dxa"/>
           </w:tcPr>
           <w:p>
             <w:pPr>
@@ -4069,61 +4611,64 @@
             </w:r>
             <w:proofErr w:type="spellEnd"/>
             <w:r>
-              <w:t xml:space="preserve"> </w:t>
-            </w:r>
-            <w:proofErr w:type="spellStart"/>
-            <w:r>
-              <w:t>vacía</w:t>
-            </w:r>
-            <w:proofErr w:type="spellEnd"/>
-            <w:r>
-              <w:t xml:space="preserve"> </w:t>
-            </w:r>
-            <w:r>
+              <w:t xml:space="preserve"> “Calle Mayor 5” </w:t>
+            </w:r>
+          </w:p>
+        </w:tc>
+        <w:tc>
+          <w:tcPr>
+            <w:tcW w:w="1688" w:type="dxa"/>
+          </w:tcPr>
+          <w:p>
+            <w:pPr>
+              <w:rPr>
+                <w:lang w:val="es-ES"/>
+              </w:rPr>
+            </w:pPr>
+            <w:r>
+              <w:rPr>
+                <w:lang w:val="es-ES"/>
+              </w:rPr>
+              <w:t xml:space="preserve">Modelo no informado para la </w:t>
+            </w:r>
+            <w:r>
+              <w:rPr>
+                <w:lang w:val="es-ES"/>
+              </w:rPr>
               <w:lastRenderedPageBreak/>
-              <w:t>(“”) </w:t>
-            </w:r>
-          </w:p>
-        </w:tc>
-        <w:tc>
-          <w:tcPr>
-            <w:tcW w:w="1491" w:type="dxa"/>
-          </w:tcPr>
-          <w:p>
-            <w:pPr>
-              <w:rPr>
-                <w:lang w:val="es-ES"/>
-              </w:rPr>
-            </w:pPr>
-            <w:r>
+              <w:t>reparación </w:t>
+            </w:r>
+          </w:p>
+        </w:tc>
+        <w:tc>
+          <w:tcPr>
+            <w:tcW w:w="1108" w:type="dxa"/>
+          </w:tcPr>
+          <w:p>
+            <w:pPr>
+              <w:rPr>
+                <w:lang w:val="es-ES"/>
+              </w:rPr>
+            </w:pPr>
+            <w:r>
+              <w:rPr>
+                <w:lang w:val="es-ES"/>
+              </w:rPr>
               <w:lastRenderedPageBreak/>
-              <w:t xml:space="preserve">Modelo </w:t>
-            </w:r>
-            <w:proofErr w:type="gramStart"/>
-            <w:r>
-              <w:t>para REPAIR</w:t>
-            </w:r>
-            <w:proofErr w:type="gramEnd"/>
-            <w:r>
-              <w:t>_NAM</w:t>
-            </w:r>
-            <w:r>
+              <w:t xml:space="preserve">Método pago: “Tarjeta </w:t>
+            </w:r>
+            <w:r>
+              <w:rPr>
+                <w:lang w:val="es-ES"/>
+              </w:rPr>
               <w:lastRenderedPageBreak/>
-              <w:t>E_1: “</w:t>
-            </w:r>
-            <w:proofErr w:type="spellStart"/>
-            <w:r>
-              <w:t>Iphone</w:t>
-            </w:r>
-            <w:proofErr w:type="spellEnd"/>
-            <w:r>
-              <w:t>” </w:t>
-            </w:r>
-          </w:p>
-        </w:tc>
-        <w:tc>
-          <w:tcPr>
-            <w:tcW w:w="1460" w:type="dxa"/>
+              <w:t>de Crédito” </w:t>
+            </w:r>
+          </w:p>
+        </w:tc>
+        <w:tc>
+          <w:tcPr>
+            <w:tcW w:w="2011" w:type="dxa"/>
           </w:tcPr>
           <w:p>
             <w:pPr>
@@ -4136,40 +4681,7 @@
                 <w:lang w:val="es-ES"/>
               </w:rPr>
               <w:lastRenderedPageBreak/>
-              <w:t xml:space="preserve">Método pago: </w:t>
-            </w:r>
-            <w:r>
-              <w:rPr>
-                <w:lang w:val="es-ES"/>
-              </w:rPr>
-              <w:lastRenderedPageBreak/>
-              <w:t>“Tarjeta de Crédito” </w:t>
-            </w:r>
-          </w:p>
-        </w:tc>
-        <w:tc>
-          <w:tcPr>
-            <w:tcW w:w="2266" w:type="dxa"/>
-          </w:tcPr>
-          <w:p>
-            <w:pPr>
-              <w:rPr>
-                <w:lang w:val="es-ES"/>
-              </w:rPr>
-            </w:pPr>
-            <w:r>
-              <w:rPr>
-                <w:lang w:val="es-ES"/>
-              </w:rPr>
-              <w:lastRenderedPageBreak/>
-              <w:t xml:space="preserve">Al enviar, se permanece en la </w:t>
-            </w:r>
-            <w:r>
-              <w:rPr>
-                <w:lang w:val="es-ES"/>
-              </w:rPr>
-              <w:lastRenderedPageBreak/>
-              <w:t>página de creación y/o se muestran errores de validación por falta de dirección. </w:t>
+              <w:t>Mensaje: El modelo a reparar es obligatorio</w:t>
             </w:r>
           </w:p>
         </w:tc>
@@ -4177,7 +4689,7 @@
       <w:tr>
         <w:tc>
           <w:tcPr>
-            <w:tcW w:w="1019" w:type="dxa"/>
+            <w:tcW w:w="662" w:type="dxa"/>
           </w:tcPr>
           <w:p>
             <w:pPr>
@@ -4193,231 +4705,68 @@
                 <w:bCs/>
                 <w:lang w:val="es-ES"/>
               </w:rPr>
-              <w:lastRenderedPageBreak/>
-              <w:t>UC4-08d</w:t>
-            </w:r>
-          </w:p>
-        </w:tc>
-        <w:tc>
-          <w:tcPr>
-            <w:tcW w:w="2208" w:type="dxa"/>
-          </w:tcPr>
-          <w:p>
-            <w:pPr>
-              <w:rPr>
-                <w:lang w:val="es-ES"/>
-              </w:rPr>
-            </w:pPr>
-            <w:r>
-              <w:rPr>
-                <w:lang w:val="es-ES"/>
-              </w:rPr>
-              <w:t>Esc-6</w:t>
-            </w:r>
-            <w:r>
-              <w:rPr>
-                <w:lang w:val="es-ES"/>
-              </w:rPr>
-              <w:t xml:space="preserve"> / Modelo </w:t>
-            </w:r>
-            <w:proofErr w:type="spellStart"/>
-            <w:r>
-              <w:rPr>
-                <w:lang w:val="es-ES"/>
-              </w:rPr>
-              <w:t>Vacio</w:t>
-            </w:r>
-            <w:proofErr w:type="spellEnd"/>
-          </w:p>
-        </w:tc>
-        <w:tc>
-          <w:tcPr>
-            <w:tcW w:w="1518" w:type="dxa"/>
-          </w:tcPr>
-          <w:p>
-            <w:pPr>
-              <w:rPr>
-                <w:lang w:val="es-ES"/>
-              </w:rPr>
-            </w:pPr>
-            <w:proofErr w:type="spellStart"/>
-            <w:r>
-              <w:t>Carrito</w:t>
-            </w:r>
-            <w:proofErr w:type="spellEnd"/>
-            <w:r>
-              <w:t xml:space="preserve"> con REPAIR_NAME_1 </w:t>
-            </w:r>
-          </w:p>
-        </w:tc>
-        <w:tc>
-          <w:tcPr>
-            <w:tcW w:w="1607" w:type="dxa"/>
-          </w:tcPr>
-          <w:p>
-            <w:pPr>
-              <w:rPr>
-                <w:lang w:val="es-ES"/>
-              </w:rPr>
-            </w:pPr>
-            <w:r>
-              <w:t xml:space="preserve">Nombre “Luis”, </w:t>
-            </w:r>
-            <w:proofErr w:type="spellStart"/>
-            <w:r>
-              <w:t>apellidos</w:t>
-            </w:r>
-            <w:proofErr w:type="spellEnd"/>
-            <w:r>
-              <w:t xml:space="preserve"> “Lorenzo” </w:t>
-            </w:r>
-          </w:p>
-        </w:tc>
-        <w:tc>
-          <w:tcPr>
-            <w:tcW w:w="1607" w:type="dxa"/>
-          </w:tcPr>
-          <w:p>
-            <w:pPr>
-              <w:rPr>
-                <w:lang w:val="es-ES"/>
-              </w:rPr>
-            </w:pPr>
-            <w:proofErr w:type="spellStart"/>
-            <w:r>
-              <w:t>Dirección</w:t>
-            </w:r>
-            <w:proofErr w:type="spellEnd"/>
-            <w:r>
-              <w:t xml:space="preserve"> “Calle Mayor 5” </w:t>
-            </w:r>
-          </w:p>
-        </w:tc>
-        <w:tc>
-          <w:tcPr>
-            <w:tcW w:w="1491" w:type="dxa"/>
-          </w:tcPr>
-          <w:p>
-            <w:pPr>
-              <w:rPr>
-                <w:lang w:val="es-ES"/>
-              </w:rPr>
-            </w:pPr>
-            <w:r>
-              <w:rPr>
-                <w:lang w:val="es-ES"/>
-              </w:rPr>
-              <w:t>Modelo no informado para la reparación </w:t>
-            </w:r>
-          </w:p>
-        </w:tc>
-        <w:tc>
-          <w:tcPr>
-            <w:tcW w:w="1460" w:type="dxa"/>
-          </w:tcPr>
-          <w:p>
-            <w:pPr>
-              <w:rPr>
-                <w:lang w:val="es-ES"/>
-              </w:rPr>
-            </w:pPr>
-            <w:r>
-              <w:rPr>
-                <w:lang w:val="es-ES"/>
-              </w:rPr>
-              <w:t>Método pago: “Tarjeta de Crédito” </w:t>
-            </w:r>
-          </w:p>
-        </w:tc>
-        <w:tc>
-          <w:tcPr>
-            <w:tcW w:w="2266" w:type="dxa"/>
-          </w:tcPr>
-          <w:p>
-            <w:pPr>
-              <w:rPr>
-                <w:lang w:val="es-ES"/>
-              </w:rPr>
-            </w:pPr>
-            <w:r>
-              <w:rPr>
-                <w:lang w:val="es-ES"/>
-              </w:rPr>
-              <w:t>Al enviar, se permanece en la página de creación y/o se muestran errores de validación por falta de modelo. </w:t>
-            </w:r>
-          </w:p>
-        </w:tc>
-      </w:tr>
-      <w:tr>
-        <w:tc>
-          <w:tcPr>
-            <w:tcW w:w="1019" w:type="dxa"/>
-          </w:tcPr>
-          <w:p>
-            <w:pPr>
-              <w:rPr>
-                <w:b/>
-                <w:bCs/>
-                <w:lang w:val="es-ES"/>
-              </w:rPr>
-            </w:pPr>
-            <w:r>
-              <w:rPr>
-                <w:b/>
-                <w:bCs/>
-                <w:lang w:val="es-ES"/>
-              </w:rPr>
               <w:t>UC4-09</w:t>
             </w:r>
           </w:p>
         </w:tc>
         <w:tc>
           <w:tcPr>
-            <w:tcW w:w="2208" w:type="dxa"/>
-          </w:tcPr>
-          <w:p>
-            <w:pPr>
-              <w:rPr>
-                <w:lang w:val="es-ES"/>
-              </w:rPr>
-            </w:pPr>
-            <w:r>
-              <w:rPr>
-                <w:lang w:val="es-ES"/>
-              </w:rPr>
-              <w:t>Esc-7</w:t>
-            </w:r>
-            <w:r>
-              <w:rPr>
-                <w:lang w:val="es-ES"/>
-              </w:rPr>
-              <w:t xml:space="preserve"> / Modificar reparaciones desde pantalla de creación</w:t>
-            </w:r>
-          </w:p>
-        </w:tc>
-        <w:tc>
-          <w:tcPr>
-            <w:tcW w:w="1518" w:type="dxa"/>
-          </w:tcPr>
-          <w:p>
-            <w:pPr>
-              <w:rPr>
-                <w:lang w:val="es-ES"/>
-              </w:rPr>
-            </w:pPr>
-            <w:proofErr w:type="spellStart"/>
-            <w:r>
-              <w:t>Carrito</w:t>
-            </w:r>
-            <w:proofErr w:type="spellEnd"/>
-            <w:r>
-              <w:t xml:space="preserve"> con REPAIR_NAME_1 </w:t>
-            </w:r>
-          </w:p>
-        </w:tc>
-        <w:tc>
-          <w:tcPr>
-            <w:tcW w:w="1607" w:type="dxa"/>
+            <w:tcW w:w="1845" w:type="dxa"/>
+          </w:tcPr>
+          <w:p>
+            <w:pPr>
+              <w:rPr>
+                <w:lang w:val="es-ES"/>
+              </w:rPr>
+            </w:pPr>
+            <w:r>
+              <w:rPr>
+                <w:lang w:val="es-ES"/>
+              </w:rPr>
+              <w:t>Esc-7 / Modificar reparaciones desde pantalla de creación</w:t>
+            </w:r>
+          </w:p>
+        </w:tc>
+        <w:tc>
+          <w:tcPr>
+            <w:tcW w:w="3322" w:type="dxa"/>
+          </w:tcPr>
+          <w:p>
+            <w:pPr>
+              <w:rPr>
+                <w:lang w:val="es-ES"/>
+              </w:rPr>
+            </w:pPr>
+            <w:r>
+              <w:rPr>
+                <w:lang w:val="es-ES"/>
+              </w:rPr>
+              <w:t xml:space="preserve">Carrito con </w:t>
+            </w:r>
+            <w:r>
+              <w:rPr>
+                <w:u w:val="single"/>
+                <w:lang w:val="es-ES"/>
+              </w:rPr>
+              <w:t>reparación</w:t>
+            </w:r>
+            <w:r>
+              <w:rPr>
+                <w:lang w:val="es-ES"/>
+              </w:rPr>
+              <w:t xml:space="preserve"> de sensor</w:t>
+            </w:r>
+            <w:r>
+              <w:rPr>
+                <w:lang w:val="es-ES"/>
+              </w:rPr>
+              <w:t> </w:t>
+            </w:r>
+          </w:p>
+        </w:tc>
+        <w:tc>
+          <w:tcPr>
+            <w:tcW w:w="1258" w:type="dxa"/>
           </w:tcPr>
           <w:p>
             <w:pPr>
@@ -4435,7 +4784,7 @@
         </w:tc>
         <w:tc>
           <w:tcPr>
-            <w:tcW w:w="1607" w:type="dxa"/>
+            <w:tcW w:w="1282" w:type="dxa"/>
           </w:tcPr>
           <w:p>
             <w:pPr>
@@ -4461,13 +4810,19 @@
               <w:rPr>
                 <w:lang w:val="es-ES"/>
               </w:rPr>
-              <w:t xml:space="preserve"> solo nombre) </w:t>
-            </w:r>
-          </w:p>
-        </w:tc>
-        <w:tc>
-          <w:tcPr>
-            <w:tcW w:w="1491" w:type="dxa"/>
+              <w:t xml:space="preserve"> nombre: Luis, apellido: Lorenzo</w:t>
+            </w:r>
+            <w:r>
+              <w:rPr>
+                <w:lang w:val="es-ES"/>
+              </w:rPr>
+              <w:t>) </w:t>
+            </w:r>
+          </w:p>
+        </w:tc>
+        <w:tc>
+          <w:tcPr>
+            <w:tcW w:w="1688" w:type="dxa"/>
           </w:tcPr>
           <w:p>
             <w:pPr>
@@ -4485,19 +4840,19 @@
         </w:tc>
         <w:tc>
           <w:tcPr>
-            <w:tcW w:w="1460" w:type="dxa"/>
-          </w:tcPr>
-          <w:p>
-            <w:pPr>
-              <w:rPr>
-                <w:lang w:val="es-ES"/>
-              </w:rPr>
-            </w:pPr>
-          </w:p>
-        </w:tc>
-        <w:tc>
-          <w:tcPr>
-            <w:tcW w:w="2266" w:type="dxa"/>
+            <w:tcW w:w="1108" w:type="dxa"/>
+          </w:tcPr>
+          <w:p>
+            <w:pPr>
+              <w:rPr>
+                <w:lang w:val="es-ES"/>
+              </w:rPr>
+            </w:pPr>
+          </w:p>
+        </w:tc>
+        <w:tc>
+          <w:tcPr>
+            <w:tcW w:w="2011" w:type="dxa"/>
           </w:tcPr>
           <w:p>
             <w:pPr>
@@ -4698,7 +5053,6 @@
         <w:rPr>
           <w:lang w:val="es-ES"/>
         </w:rPr>
-        <w:lastRenderedPageBreak/>
         <w:t>Otros</w:t>
       </w:r>
       <w:bookmarkEnd w:id="7"/>
@@ -4895,7 +5249,14 @@
         <w:rPr>
           <w:lang w:val="es-ES"/>
         </w:rPr>
-        <w:t xml:space="preserve"> Probar flujo completo al menos una vez con datos válidos</w:t>
+        <w:t xml:space="preserve"> Probar flujo completo al menos una vez con datos </w:t>
+      </w:r>
+      <w:r>
+        <w:rPr>
+          <w:u w:val="single"/>
+          <w:lang w:val="es-ES"/>
+        </w:rPr>
+        <w:t>válidos</w:t>
       </w:r>
     </w:p>
     <w:p>
@@ -4917,6 +5278,7 @@
         <w:rPr>
           <w:lang w:val="es-ES"/>
         </w:rPr>
+        <w:lastRenderedPageBreak/>
         <w:t xml:space="preserve">Dependencias entre </w:t>
       </w:r>
       <w:r>
@@ -5508,6 +5870,155 @@
     </w:lvl>
   </w:abstractNum>
   <w:abstractNum w:abstractNumId="2" w15:restartNumberingAfterBreak="0">
+    <w:nsid w:val="06D24828"/>
+    <w:multiLevelType w:val="multilevel"/>
+    <w:tmpl w:val="D8609DAE"/>
+    <w:lvl w:ilvl="0">
+      <w:start w:val="1"/>
+      <w:numFmt w:val="bullet"/>
+      <w:lvlText w:val=""/>
+      <w:lvlJc w:val="left"/>
+      <w:pPr>
+        <w:tabs>
+          <w:tab w:val="num" w:pos="720"/>
+        </w:tabs>
+        <w:ind w:left="720" w:hanging="360"/>
+      </w:pPr>
+      <w:rPr>
+        <w:rFonts w:ascii="Symbol" w:hAnsi="Symbol" w:hint="default"/>
+        <w:sz w:val="20"/>
+      </w:rPr>
+    </w:lvl>
+    <w:lvl w:ilvl="1" w:tentative="1">
+      <w:start w:val="1"/>
+      <w:numFmt w:val="bullet"/>
+      <w:lvlText w:val="o"/>
+      <w:lvlJc w:val="left"/>
+      <w:pPr>
+        <w:tabs>
+          <w:tab w:val="num" w:pos="1440"/>
+        </w:tabs>
+        <w:ind w:left="1440" w:hanging="360"/>
+      </w:pPr>
+      <w:rPr>
+        <w:rFonts w:ascii="Courier New" w:hAnsi="Courier New" w:hint="default"/>
+        <w:sz w:val="20"/>
+      </w:rPr>
+    </w:lvl>
+    <w:lvl w:ilvl="2" w:tentative="1">
+      <w:start w:val="1"/>
+      <w:numFmt w:val="bullet"/>
+      <w:lvlText w:val=""/>
+      <w:lvlJc w:val="left"/>
+      <w:pPr>
+        <w:tabs>
+          <w:tab w:val="num" w:pos="2160"/>
+        </w:tabs>
+        <w:ind w:left="2160" w:hanging="360"/>
+      </w:pPr>
+      <w:rPr>
+        <w:rFonts w:ascii="Wingdings" w:hAnsi="Wingdings" w:hint="default"/>
+        <w:sz w:val="20"/>
+      </w:rPr>
+    </w:lvl>
+    <w:lvl w:ilvl="3" w:tentative="1">
+      <w:start w:val="1"/>
+      <w:numFmt w:val="bullet"/>
+      <w:lvlText w:val=""/>
+      <w:lvlJc w:val="left"/>
+      <w:pPr>
+        <w:tabs>
+          <w:tab w:val="num" w:pos="2880"/>
+        </w:tabs>
+        <w:ind w:left="2880" w:hanging="360"/>
+      </w:pPr>
+      <w:rPr>
+        <w:rFonts w:ascii="Wingdings" w:hAnsi="Wingdings" w:hint="default"/>
+        <w:sz w:val="20"/>
+      </w:rPr>
+    </w:lvl>
+    <w:lvl w:ilvl="4" w:tentative="1">
+      <w:start w:val="1"/>
+      <w:numFmt w:val="bullet"/>
+      <w:lvlText w:val=""/>
+      <w:lvlJc w:val="left"/>
+      <w:pPr>
+        <w:tabs>
+          <w:tab w:val="num" w:pos="3600"/>
+        </w:tabs>
+        <w:ind w:left="3600" w:hanging="360"/>
+      </w:pPr>
+      <w:rPr>
+        <w:rFonts w:ascii="Wingdings" w:hAnsi="Wingdings" w:hint="default"/>
+        <w:sz w:val="20"/>
+      </w:rPr>
+    </w:lvl>
+    <w:lvl w:ilvl="5" w:tentative="1">
+      <w:start w:val="1"/>
+      <w:numFmt w:val="bullet"/>
+      <w:lvlText w:val=""/>
+      <w:lvlJc w:val="left"/>
+      <w:pPr>
+        <w:tabs>
+          <w:tab w:val="num" w:pos="4320"/>
+        </w:tabs>
+        <w:ind w:left="4320" w:hanging="360"/>
+      </w:pPr>
+      <w:rPr>
+        <w:rFonts w:ascii="Wingdings" w:hAnsi="Wingdings" w:hint="default"/>
+        <w:sz w:val="20"/>
+      </w:rPr>
+    </w:lvl>
+    <w:lvl w:ilvl="6" w:tentative="1">
+      <w:start w:val="1"/>
+      <w:numFmt w:val="bullet"/>
+      <w:lvlText w:val=""/>
+      <w:lvlJc w:val="left"/>
+      <w:pPr>
+        <w:tabs>
+          <w:tab w:val="num" w:pos="5040"/>
+        </w:tabs>
+        <w:ind w:left="5040" w:hanging="360"/>
+      </w:pPr>
+      <w:rPr>
+        <w:rFonts w:ascii="Wingdings" w:hAnsi="Wingdings" w:hint="default"/>
+        <w:sz w:val="20"/>
+      </w:rPr>
+    </w:lvl>
+    <w:lvl w:ilvl="7" w:tentative="1">
+      <w:start w:val="1"/>
+      <w:numFmt w:val="bullet"/>
+      <w:lvlText w:val=""/>
+      <w:lvlJc w:val="left"/>
+      <w:pPr>
+        <w:tabs>
+          <w:tab w:val="num" w:pos="5760"/>
+        </w:tabs>
+        <w:ind w:left="5760" w:hanging="360"/>
+      </w:pPr>
+      <w:rPr>
+        <w:rFonts w:ascii="Wingdings" w:hAnsi="Wingdings" w:hint="default"/>
+        <w:sz w:val="20"/>
+      </w:rPr>
+    </w:lvl>
+    <w:lvl w:ilvl="8" w:tentative="1">
+      <w:start w:val="1"/>
+      <w:numFmt w:val="bullet"/>
+      <w:lvlText w:val=""/>
+      <w:lvlJc w:val="left"/>
+      <w:pPr>
+        <w:tabs>
+          <w:tab w:val="num" w:pos="6480"/>
+        </w:tabs>
+        <w:ind w:left="6480" w:hanging="360"/>
+      </w:pPr>
+      <w:rPr>
+        <w:rFonts w:ascii="Wingdings" w:hAnsi="Wingdings" w:hint="default"/>
+        <w:sz w:val="20"/>
+      </w:rPr>
+    </w:lvl>
+  </w:abstractNum>
+  <w:abstractNum w:abstractNumId="3" w15:restartNumberingAfterBreak="0">
     <w:nsid w:val="085C5C95"/>
     <w:multiLevelType w:val="hybridMultilevel"/>
     <w:tmpl w:val="9D2E7A18"/>
@@ -5620,7 +6131,156 @@
       </w:rPr>
     </w:lvl>
   </w:abstractNum>
-  <w:abstractNum w:abstractNumId="3" w15:restartNumberingAfterBreak="0">
+  <w:abstractNum w:abstractNumId="4" w15:restartNumberingAfterBreak="0">
+    <w:nsid w:val="35193D8A"/>
+    <w:multiLevelType w:val="multilevel"/>
+    <w:tmpl w:val="1626F36C"/>
+    <w:lvl w:ilvl="0">
+      <w:start w:val="1"/>
+      <w:numFmt w:val="bullet"/>
+      <w:lvlText w:val=""/>
+      <w:lvlJc w:val="left"/>
+      <w:pPr>
+        <w:tabs>
+          <w:tab w:val="num" w:pos="720"/>
+        </w:tabs>
+        <w:ind w:left="720" w:hanging="360"/>
+      </w:pPr>
+      <w:rPr>
+        <w:rFonts w:ascii="Symbol" w:hAnsi="Symbol" w:hint="default"/>
+        <w:sz w:val="20"/>
+      </w:rPr>
+    </w:lvl>
+    <w:lvl w:ilvl="1" w:tentative="1">
+      <w:start w:val="1"/>
+      <w:numFmt w:val="bullet"/>
+      <w:lvlText w:val="o"/>
+      <w:lvlJc w:val="left"/>
+      <w:pPr>
+        <w:tabs>
+          <w:tab w:val="num" w:pos="1440"/>
+        </w:tabs>
+        <w:ind w:left="1440" w:hanging="360"/>
+      </w:pPr>
+      <w:rPr>
+        <w:rFonts w:ascii="Courier New" w:hAnsi="Courier New" w:hint="default"/>
+        <w:sz w:val="20"/>
+      </w:rPr>
+    </w:lvl>
+    <w:lvl w:ilvl="2" w:tentative="1">
+      <w:start w:val="1"/>
+      <w:numFmt w:val="bullet"/>
+      <w:lvlText w:val=""/>
+      <w:lvlJc w:val="left"/>
+      <w:pPr>
+        <w:tabs>
+          <w:tab w:val="num" w:pos="2160"/>
+        </w:tabs>
+        <w:ind w:left="2160" w:hanging="360"/>
+      </w:pPr>
+      <w:rPr>
+        <w:rFonts w:ascii="Wingdings" w:hAnsi="Wingdings" w:hint="default"/>
+        <w:sz w:val="20"/>
+      </w:rPr>
+    </w:lvl>
+    <w:lvl w:ilvl="3" w:tentative="1">
+      <w:start w:val="1"/>
+      <w:numFmt w:val="bullet"/>
+      <w:lvlText w:val=""/>
+      <w:lvlJc w:val="left"/>
+      <w:pPr>
+        <w:tabs>
+          <w:tab w:val="num" w:pos="2880"/>
+        </w:tabs>
+        <w:ind w:left="2880" w:hanging="360"/>
+      </w:pPr>
+      <w:rPr>
+        <w:rFonts w:ascii="Wingdings" w:hAnsi="Wingdings" w:hint="default"/>
+        <w:sz w:val="20"/>
+      </w:rPr>
+    </w:lvl>
+    <w:lvl w:ilvl="4" w:tentative="1">
+      <w:start w:val="1"/>
+      <w:numFmt w:val="bullet"/>
+      <w:lvlText w:val=""/>
+      <w:lvlJc w:val="left"/>
+      <w:pPr>
+        <w:tabs>
+          <w:tab w:val="num" w:pos="3600"/>
+        </w:tabs>
+        <w:ind w:left="3600" w:hanging="360"/>
+      </w:pPr>
+      <w:rPr>
+        <w:rFonts w:ascii="Wingdings" w:hAnsi="Wingdings" w:hint="default"/>
+        <w:sz w:val="20"/>
+      </w:rPr>
+    </w:lvl>
+    <w:lvl w:ilvl="5" w:tentative="1">
+      <w:start w:val="1"/>
+      <w:numFmt w:val="bullet"/>
+      <w:lvlText w:val=""/>
+      <w:lvlJc w:val="left"/>
+      <w:pPr>
+        <w:tabs>
+          <w:tab w:val="num" w:pos="4320"/>
+        </w:tabs>
+        <w:ind w:left="4320" w:hanging="360"/>
+      </w:pPr>
+      <w:rPr>
+        <w:rFonts w:ascii="Wingdings" w:hAnsi="Wingdings" w:hint="default"/>
+        <w:sz w:val="20"/>
+      </w:rPr>
+    </w:lvl>
+    <w:lvl w:ilvl="6" w:tentative="1">
+      <w:start w:val="1"/>
+      <w:numFmt w:val="bullet"/>
+      <w:lvlText w:val=""/>
+      <w:lvlJc w:val="left"/>
+      <w:pPr>
+        <w:tabs>
+          <w:tab w:val="num" w:pos="5040"/>
+        </w:tabs>
+        <w:ind w:left="5040" w:hanging="360"/>
+      </w:pPr>
+      <w:rPr>
+        <w:rFonts w:ascii="Wingdings" w:hAnsi="Wingdings" w:hint="default"/>
+        <w:sz w:val="20"/>
+      </w:rPr>
+    </w:lvl>
+    <w:lvl w:ilvl="7" w:tentative="1">
+      <w:start w:val="1"/>
+      <w:numFmt w:val="bullet"/>
+      <w:lvlText w:val=""/>
+      <w:lvlJc w:val="left"/>
+      <w:pPr>
+        <w:tabs>
+          <w:tab w:val="num" w:pos="5760"/>
+        </w:tabs>
+        <w:ind w:left="5760" w:hanging="360"/>
+      </w:pPr>
+      <w:rPr>
+        <w:rFonts w:ascii="Wingdings" w:hAnsi="Wingdings" w:hint="default"/>
+        <w:sz w:val="20"/>
+      </w:rPr>
+    </w:lvl>
+    <w:lvl w:ilvl="8" w:tentative="1">
+      <w:start w:val="1"/>
+      <w:numFmt w:val="bullet"/>
+      <w:lvlText w:val=""/>
+      <w:lvlJc w:val="left"/>
+      <w:pPr>
+        <w:tabs>
+          <w:tab w:val="num" w:pos="6480"/>
+        </w:tabs>
+        <w:ind w:left="6480" w:hanging="360"/>
+      </w:pPr>
+      <w:rPr>
+        <w:rFonts w:ascii="Wingdings" w:hAnsi="Wingdings" w:hint="default"/>
+        <w:sz w:val="20"/>
+      </w:rPr>
+    </w:lvl>
+  </w:abstractNum>
+  <w:abstractNum w:abstractNumId="5" w15:restartNumberingAfterBreak="0">
     <w:nsid w:val="71285D25"/>
     <w:multiLevelType w:val="hybridMultilevel"/>
     <w:tmpl w:val="C8BA106A"/>
@@ -5746,10 +6406,16 @@
     </w:lvlOverride>
   </w:num>
   <w:num w:numId="4" w16cid:durableId="2007974493">
+    <w:abstractNumId w:val="5"/>
+  </w:num>
+  <w:num w:numId="5" w16cid:durableId="1688553329">
     <w:abstractNumId w:val="3"/>
   </w:num>
-  <w:num w:numId="5" w16cid:durableId="1688553329">
+  <w:num w:numId="6" w16cid:durableId="1103456011">
     <w:abstractNumId w:val="2"/>
+  </w:num>
+  <w:num w:numId="7" w16cid:durableId="32852169">
+    <w:abstractNumId w:val="4"/>
   </w:num>
 </w:numbering>
 </file>

</xml_diff>